<commit_message>
Created SendtoGcode and updated all flowcharts with error tracking. All left is testing information
</commit_message>
<xml_diff>
--- a/ProjectPlanning egyeb12.docx
+++ b/ProjectPlanning egyeb12.docx
@@ -33,12 +33,36 @@
     </w:p>
     <w:p>
       <w:r>
-        <w:t>The Code initially opens and reads a txt file containing the font data and gets a user input for the font size. Using the font G code data and size the positions and code for each character in the txt file is translated to the correct format and scaled, before being stored in an array (WordGCode()). Each letter can be accessed from x position in the array, where x is the starting location for each character which is determined by a for loop and the positions are stored in a different array (CharLocation()).</w:t>
-      </w:r>
-    </w:p>
-    <w:p>
-      <w:r>
-        <w:t>The txt file containing the text to be "written" is then opened, and each word is separated and stored in separate columns of an array  (WordContents()). The initial conditions for the robot are then generated and sent (spindle on, pen up and position at 0,0).</w:t>
+        <w:t>The Code initially opens and reads a txt file containing the font data and gets a user input for the font size. Using the font G code data and size the positions and code for each character in the txt file is translated to the correct format and scaled, before being stored in an array (</w:t>
+      </w:r>
+      <w:proofErr w:type="spellStart"/>
+      <w:r>
+        <w:t>WordGCode</w:t>
+      </w:r>
+      <w:proofErr w:type="spellEnd"/>
+      <w:r>
+        <w:t>()). Each letter can be accessed from x position in the array, where x is the starting location for each character which is determined by a for loop and the positions are stored in a different array (</w:t>
+      </w:r>
+      <w:proofErr w:type="spellStart"/>
+      <w:r>
+        <w:t>CharLocation</w:t>
+      </w:r>
+      <w:proofErr w:type="spellEnd"/>
+      <w:r>
+        <w:t>()).</w:t>
+      </w:r>
+    </w:p>
+    <w:p>
+      <w:r>
+        <w:t>The txt file containing the text to be "written" is then opened, and each word is separated and stored in separate columns of an array  (</w:t>
+      </w:r>
+      <w:proofErr w:type="spellStart"/>
+      <w:r>
+        <w:t>WordContents</w:t>
+      </w:r>
+      <w:proofErr w:type="spellEnd"/>
+      <w:r>
+        <w:t>()). The initial conditions for the robot are then generated and sent (spindle on, pen up and position at 0,0).</w:t>
       </w:r>
     </w:p>
     <w:p>
@@ -51,7 +75,15 @@
         <w:ind w:left="720"/>
       </w:pPr>
       <w:r>
-        <w:t>1. The x and y starting positions determined (if the word length + current words in line are greater than the maximum x space on page a new line is made and the word starts on the new line (change in y)) (x position is then determined as if its on a new line it is 0 and if its carrying on from the last word it is the ending x point of the last word plus a gap)</w:t>
+        <w:t xml:space="preserve">1. The x and y starting positions determined (if the word length + current words in line are greater than the maximum x space on page a new line is made and the word starts on the new line (change in y)) (x position is then determined as if </w:t>
+      </w:r>
+      <w:proofErr w:type="spellStart"/>
+      <w:r>
+        <w:t>its</w:t>
+      </w:r>
+      <w:proofErr w:type="spellEnd"/>
+      <w:r>
+        <w:t xml:space="preserve"> on a new line it is 0 and if its carrying on from the last word it is the ending x point of the last word plus a gap)</w:t>
       </w:r>
     </w:p>
     <w:p>
@@ -66,7 +98,15 @@
       </w:r>
       <w:r>
         <w:tab/>
-        <w:t>a. The character is read and the location of the G code in WordGCode() is found</w:t>
+        <w:t xml:space="preserve">a. The character is read and the location of the G code in </w:t>
+      </w:r>
+      <w:proofErr w:type="spellStart"/>
+      <w:r>
+        <w:t>WordGCode</w:t>
+      </w:r>
+      <w:proofErr w:type="spellEnd"/>
+      <w:r>
+        <w:t>() is found</w:t>
       </w:r>
     </w:p>
     <w:p>
@@ -74,7 +114,15 @@
         <w:ind w:left="1440"/>
       </w:pPr>
       <w:r>
-        <w:t>b. From the x and y starting point the Gcode is loaded in from the file and the x and y starting positions are added to all lines of the code for that character.</w:t>
+        <w:t xml:space="preserve">b. From the x and y starting point the </w:t>
+      </w:r>
+      <w:proofErr w:type="spellStart"/>
+      <w:r>
+        <w:t>Gcode</w:t>
+      </w:r>
+      <w:proofErr w:type="spellEnd"/>
+      <w:r>
+        <w:t xml:space="preserve"> is loaded in from the file and the x and y starting positions are added to all lines of the code for that character.</w:t>
       </w:r>
     </w:p>
     <w:p>
@@ -82,7 +130,15 @@
         <w:ind w:left="1440"/>
       </w:pPr>
       <w:r>
-        <w:t>c. The data is formatted into the exact G code style needed and stored in        CurrentWordGCode()</w:t>
+        <w:t xml:space="preserve">c. The data is formatted into the exact G code style needed and stored in        </w:t>
+      </w:r>
+      <w:proofErr w:type="spellStart"/>
+      <w:r>
+        <w:t>CurrentWordGCode</w:t>
+      </w:r>
+      <w:proofErr w:type="spellEnd"/>
+      <w:r>
+        <w:t>()</w:t>
       </w:r>
     </w:p>
     <w:p>
@@ -116,7 +172,15 @@
         <w:ind w:left="720"/>
       </w:pPr>
       <w:r>
-        <w:t>4. The CurrentWordGCode() data is processed into the correct data channels and sent to the robot.</w:t>
+        <w:t xml:space="preserve">4. The </w:t>
+      </w:r>
+      <w:proofErr w:type="spellStart"/>
+      <w:r>
+        <w:t>CurrentWordGCode</w:t>
+      </w:r>
+      <w:proofErr w:type="spellEnd"/>
+      <w:r>
+        <w:t>() data is processed into the correct data channels and sent to the robot.</w:t>
       </w:r>
     </w:p>
     <w:p>
@@ -151,7 +215,6 @@
         <w:t>Key Data Items</w:t>
       </w:r>
     </w:p>
-    <w:p/>
     <w:tbl>
       <w:tblPr>
         <w:tblStyle w:val="TableGrid"/>
@@ -227,8 +290,13 @@
             <w:tcW w:w="2136" w:type="dxa"/>
           </w:tcPr>
           <w:p>
-            <w:r>
-              <w:t>WordContents()</w:t>
+            <w:proofErr w:type="spellStart"/>
+            <w:r>
+              <w:t>WordContents</w:t>
+            </w:r>
+            <w:proofErr w:type="spellEnd"/>
+            <w:r>
+              <w:t>()</w:t>
             </w:r>
           </w:p>
         </w:tc>
@@ -268,8 +336,13 @@
             <w:tcW w:w="2136" w:type="dxa"/>
           </w:tcPr>
           <w:p>
-            <w:r>
-              <w:t>CharGCode()</w:t>
+            <w:proofErr w:type="spellStart"/>
+            <w:r>
+              <w:t>CharGCode</w:t>
+            </w:r>
+            <w:proofErr w:type="spellEnd"/>
+            <w:r>
+              <w:t>()</w:t>
             </w:r>
           </w:p>
         </w:tc>
@@ -321,9 +394,11 @@
             <w:tcW w:w="2136" w:type="dxa"/>
           </w:tcPr>
           <w:p>
+            <w:proofErr w:type="spellStart"/>
             <w:r>
               <w:t>CharLocation</w:t>
             </w:r>
+            <w:proofErr w:type="spellEnd"/>
             <w:r>
               <w:t>()</w:t>
             </w:r>
@@ -353,9 +428,11 @@
             <w:r>
               <w:t xml:space="preserve">the </w:t>
             </w:r>
+            <w:proofErr w:type="spellStart"/>
             <w:r>
               <w:t>CharGCode</w:t>
             </w:r>
+            <w:proofErr w:type="spellEnd"/>
             <w:r>
               <w:t>() array for easy lookup for every character</w:t>
             </w:r>
@@ -371,8 +448,13 @@
             <w:tcW w:w="2136" w:type="dxa"/>
           </w:tcPr>
           <w:p>
-            <w:r>
-              <w:t>CurrentWordGCode()</w:t>
+            <w:proofErr w:type="spellStart"/>
+            <w:r>
+              <w:t>CurrentWordGCode</w:t>
+            </w:r>
+            <w:proofErr w:type="spellEnd"/>
+            <w:r>
+              <w:t>()</w:t>
             </w:r>
           </w:p>
         </w:tc>
@@ -395,7 +477,15 @@
           </w:tcPr>
           <w:p>
             <w:r>
-              <w:t xml:space="preserve">Holds all the GCode for each character of the current word that is being sent to the robot which will later be converted to serial and sent </w:t>
+              <w:t xml:space="preserve">Holds all the </w:t>
+            </w:r>
+            <w:proofErr w:type="spellStart"/>
+            <w:r>
+              <w:t>GCode</w:t>
+            </w:r>
+            <w:proofErr w:type="spellEnd"/>
+            <w:r>
+              <w:t xml:space="preserve"> for each character of the current word that is being sent to the robot which will later be converted to serial and sent </w:t>
             </w:r>
           </w:p>
         </w:tc>
@@ -429,9 +519,11 @@
             <w:tcW w:w="2136" w:type="dxa"/>
           </w:tcPr>
           <w:p>
+            <w:proofErr w:type="spellStart"/>
             <w:r>
               <w:t>Xpos</w:t>
             </w:r>
+            <w:proofErr w:type="spellEnd"/>
           </w:p>
         </w:tc>
         <w:tc>
@@ -450,8 +542,13 @@
           </w:tcPr>
           <w:p>
             <w:r>
-              <w:t>X position of the pen for each section of Gcode</w:t>
-            </w:r>
+              <w:t xml:space="preserve">X position of the pen for each section of </w:t>
+            </w:r>
+            <w:proofErr w:type="spellStart"/>
+            <w:r>
+              <w:t>Gcode</w:t>
+            </w:r>
+            <w:proofErr w:type="spellEnd"/>
           </w:p>
         </w:tc>
       </w:tr>
@@ -464,9 +561,11 @@
             <w:tcW w:w="2136" w:type="dxa"/>
           </w:tcPr>
           <w:p>
+            <w:proofErr w:type="spellStart"/>
             <w:r>
               <w:t>Ypos</w:t>
             </w:r>
+            <w:proofErr w:type="spellEnd"/>
           </w:p>
         </w:tc>
         <w:tc>
@@ -485,8 +584,13 @@
           </w:tcPr>
           <w:p>
             <w:r>
-              <w:t>Y position of the pen for each section of Gcode</w:t>
-            </w:r>
+              <w:t xml:space="preserve">Y position of the pen for each section of </w:t>
+            </w:r>
+            <w:proofErr w:type="spellStart"/>
+            <w:r>
+              <w:t>Gcode</w:t>
+            </w:r>
+            <w:proofErr w:type="spellEnd"/>
           </w:p>
         </w:tc>
       </w:tr>
@@ -499,9 +603,11 @@
             <w:tcW w:w="2136" w:type="dxa"/>
           </w:tcPr>
           <w:p>
+            <w:proofErr w:type="spellStart"/>
             <w:r>
               <w:t>Ppos</w:t>
             </w:r>
+            <w:proofErr w:type="spellEnd"/>
           </w:p>
         </w:tc>
         <w:tc>
@@ -534,9 +640,11 @@
             <w:tcW w:w="2136" w:type="dxa"/>
           </w:tcPr>
           <w:p>
+            <w:proofErr w:type="spellStart"/>
             <w:r>
               <w:t>Xspacing</w:t>
             </w:r>
+            <w:proofErr w:type="spellEnd"/>
           </w:p>
         </w:tc>
         <w:tc>
@@ -572,9 +680,11 @@
             <w:tcW w:w="2136" w:type="dxa"/>
           </w:tcPr>
           <w:p>
+            <w:proofErr w:type="spellStart"/>
             <w:r>
               <w:t>Yspacing</w:t>
             </w:r>
+            <w:proofErr w:type="spellEnd"/>
           </w:p>
         </w:tc>
         <w:tc>
@@ -610,9 +720,11 @@
             <w:tcW w:w="2136" w:type="dxa"/>
           </w:tcPr>
           <w:p>
+            <w:proofErr w:type="spellStart"/>
             <w:r>
               <w:t>Penspeed</w:t>
             </w:r>
+            <w:proofErr w:type="spellEnd"/>
           </w:p>
         </w:tc>
         <w:tc>
@@ -642,19 +754,31 @@
         </w:trPr>
         <w:tc>
           <w:tcPr>
-            <w:tcW w:w="9016" w:type="dxa"/>
-            <w:gridSpan w:val="3"/>
-            <w:vAlign w:val="center"/>
-          </w:tcPr>
-          <w:p>
-            <w:pPr>
-              <w:jc w:val="center"/>
-            </w:pPr>
-            <w:r>
-              <w:t xml:space="preserve">For </w:t>
-            </w:r>
-            <w:r>
-              <w:t>word formatting</w:t>
+            <w:tcW w:w="2136" w:type="dxa"/>
+          </w:tcPr>
+          <w:p>
+            <w:r>
+              <w:t>Pen</w:t>
+            </w:r>
+          </w:p>
+        </w:tc>
+        <w:tc>
+          <w:tcPr>
+            <w:tcW w:w="1839" w:type="dxa"/>
+          </w:tcPr>
+          <w:p>
+            <w:r>
+              <w:t>Integer</w:t>
+            </w:r>
+          </w:p>
+        </w:tc>
+        <w:tc>
+          <w:tcPr>
+            <w:tcW w:w="5041" w:type="dxa"/>
+          </w:tcPr>
+          <w:p>
+            <w:r>
+              <w:t>States current position of pen (1 is up and 0 is down) used for sending G code to remove unnecessary callouts to lower / raise pen when it is already in that state</w:t>
             </w:r>
           </w:p>
         </w:tc>
@@ -665,37 +789,19 @@
         </w:trPr>
         <w:tc>
           <w:tcPr>
-            <w:tcW w:w="2136" w:type="dxa"/>
-          </w:tcPr>
-          <w:p>
-            <w:r>
-              <w:t>NumWords</w:t>
-            </w:r>
-          </w:p>
-        </w:tc>
-        <w:tc>
-          <w:tcPr>
-            <w:tcW w:w="1839" w:type="dxa"/>
-          </w:tcPr>
-          <w:p>
-            <w:r>
-              <w:t>Integer</w:t>
-            </w:r>
-          </w:p>
-        </w:tc>
-        <w:tc>
-          <w:tcPr>
-            <w:tcW w:w="5041" w:type="dxa"/>
-          </w:tcPr>
-          <w:p>
-            <w:r>
-              <w:t xml:space="preserve">Number of words in </w:t>
-            </w:r>
-            <w:r>
-              <w:t xml:space="preserve">word contents </w:t>
-            </w:r>
-            <w:r>
-              <w:t>txt file used for for loops</w:t>
+            <w:tcW w:w="9016" w:type="dxa"/>
+            <w:gridSpan w:val="3"/>
+            <w:vAlign w:val="center"/>
+          </w:tcPr>
+          <w:p>
+            <w:pPr>
+              <w:jc w:val="center"/>
+            </w:pPr>
+            <w:r>
+              <w:t xml:space="preserve">For </w:t>
+            </w:r>
+            <w:r>
+              <w:t>word formatting</w:t>
             </w:r>
           </w:p>
         </w:tc>
@@ -709,9 +815,11 @@
             <w:tcW w:w="2136" w:type="dxa"/>
           </w:tcPr>
           <w:p>
-            <w:r>
-              <w:t>NumLetters</w:t>
-            </w:r>
+            <w:proofErr w:type="spellStart"/>
+            <w:r>
+              <w:t>NumWords</w:t>
+            </w:r>
+            <w:proofErr w:type="spellEnd"/>
           </w:p>
         </w:tc>
         <w:tc>
@@ -730,7 +838,21 @@
           </w:tcPr>
           <w:p>
             <w:r>
-              <w:t>Numbers of letters in the word used for formatting word position on the paper and for loops</w:t>
+              <w:t xml:space="preserve">Number of words in </w:t>
+            </w:r>
+            <w:r>
+              <w:t xml:space="preserve">word contents </w:t>
+            </w:r>
+            <w:r>
+              <w:t xml:space="preserve">txt file used for </w:t>
+            </w:r>
+            <w:proofErr w:type="spellStart"/>
+            <w:r>
+              <w:t>for</w:t>
+            </w:r>
+            <w:proofErr w:type="spellEnd"/>
+            <w:r>
+              <w:t xml:space="preserve"> loops</w:t>
             </w:r>
           </w:p>
         </w:tc>
@@ -744,9 +866,11 @@
             <w:tcW w:w="2136" w:type="dxa"/>
           </w:tcPr>
           <w:p>
-            <w:r>
-              <w:t>WordLength</w:t>
-            </w:r>
+            <w:proofErr w:type="spellStart"/>
+            <w:r>
+              <w:t>NumLetters</w:t>
+            </w:r>
+            <w:proofErr w:type="spellEnd"/>
           </w:p>
         </w:tc>
         <w:tc>
@@ -765,7 +889,7 @@
           </w:tcPr>
           <w:p>
             <w:r>
-              <w:t>Word length derived from number of letters which is used to determine word position on the paper.</w:t>
+              <w:t>Numbers of letters in the word used for formatting word position on the paper and for loops</w:t>
             </w:r>
           </w:p>
         </w:tc>
@@ -779,9 +903,11 @@
             <w:tcW w:w="2136" w:type="dxa"/>
           </w:tcPr>
           <w:p>
-            <w:r>
-              <w:t>FontSize</w:t>
-            </w:r>
+            <w:proofErr w:type="spellStart"/>
+            <w:r>
+              <w:t>WordLength</w:t>
+            </w:r>
+            <w:proofErr w:type="spellEnd"/>
           </w:p>
         </w:tc>
         <w:tc>
@@ -800,7 +926,7 @@
           </w:tcPr>
           <w:p>
             <w:r>
-              <w:t>User inputted font size to alter the GCode to size</w:t>
+              <w:t>Word length derived from number of letters which is used to determine word position on the paper.</w:t>
             </w:r>
           </w:p>
         </w:tc>
@@ -814,9 +940,11 @@
             <w:tcW w:w="2136" w:type="dxa"/>
           </w:tcPr>
           <w:p>
-            <w:r>
-              <w:t>NumFont</w:t>
-            </w:r>
+            <w:proofErr w:type="spellStart"/>
+            <w:r>
+              <w:t>FontSize</w:t>
+            </w:r>
+            <w:proofErr w:type="spellEnd"/>
           </w:p>
         </w:tc>
         <w:tc>
@@ -835,10 +963,15 @@
           </w:tcPr>
           <w:p>
             <w:r>
-              <w:t xml:space="preserve">Number of lines in </w:t>
-            </w:r>
-            <w:r>
-              <w:t>font txt file used for for loops</w:t>
+              <w:t xml:space="preserve">User inputted font size to alter the </w:t>
+            </w:r>
+            <w:proofErr w:type="spellStart"/>
+            <w:r>
+              <w:t>GCode</w:t>
+            </w:r>
+            <w:proofErr w:type="spellEnd"/>
+            <w:r>
+              <w:t xml:space="preserve"> to size</w:t>
             </w:r>
           </w:p>
         </w:tc>
@@ -851,19 +984,44 @@
           <w:tcPr>
             <w:tcW w:w="2136" w:type="dxa"/>
           </w:tcPr>
-          <w:p/>
+          <w:p>
+            <w:proofErr w:type="spellStart"/>
+            <w:r>
+              <w:t>NumFont</w:t>
+            </w:r>
+            <w:proofErr w:type="spellEnd"/>
+          </w:p>
         </w:tc>
         <w:tc>
           <w:tcPr>
             <w:tcW w:w="1839" w:type="dxa"/>
           </w:tcPr>
-          <w:p/>
+          <w:p>
+            <w:r>
+              <w:t>Integer</w:t>
+            </w:r>
+          </w:p>
         </w:tc>
         <w:tc>
           <w:tcPr>
             <w:tcW w:w="5041" w:type="dxa"/>
           </w:tcPr>
-          <w:p/>
+          <w:p>
+            <w:r>
+              <w:t xml:space="preserve">Number of lines in </w:t>
+            </w:r>
+            <w:r>
+              <w:t xml:space="preserve">font txt file used for </w:t>
+            </w:r>
+            <w:proofErr w:type="spellStart"/>
+            <w:r>
+              <w:t>for</w:t>
+            </w:r>
+            <w:proofErr w:type="spellEnd"/>
+            <w:r>
+              <w:t xml:space="preserve"> loops</w:t>
+            </w:r>
+          </w:p>
         </w:tc>
       </w:tr>
       <w:tr>
@@ -872,21 +1030,18 @@
         </w:trPr>
         <w:tc>
           <w:tcPr>
-            <w:tcW w:w="2136" w:type="dxa"/>
-          </w:tcPr>
-          <w:p/>
-        </w:tc>
-        <w:tc>
-          <w:tcPr>
-            <w:tcW w:w="1839" w:type="dxa"/>
-          </w:tcPr>
-          <w:p/>
-        </w:tc>
-        <w:tc>
-          <w:tcPr>
-            <w:tcW w:w="5041" w:type="dxa"/>
-          </w:tcPr>
-          <w:p/>
+            <w:tcW w:w="9016" w:type="dxa"/>
+            <w:gridSpan w:val="3"/>
+            <w:vAlign w:val="center"/>
+          </w:tcPr>
+          <w:p>
+            <w:pPr>
+              <w:jc w:val="center"/>
+            </w:pPr>
+            <w:r>
+              <w:t>Miscellaneous</w:t>
+            </w:r>
+          </w:p>
         </w:tc>
       </w:tr>
       <w:tr>
@@ -897,6 +1052,54 @@
           <w:tcPr>
             <w:tcW w:w="2136" w:type="dxa"/>
           </w:tcPr>
+          <w:p>
+            <w:proofErr w:type="spellStart"/>
+            <w:r>
+              <w:t>SerialSend</w:t>
+            </w:r>
+            <w:proofErr w:type="spellEnd"/>
+          </w:p>
+        </w:tc>
+        <w:tc>
+          <w:tcPr>
+            <w:tcW w:w="1839" w:type="dxa"/>
+          </w:tcPr>
+          <w:p>
+            <w:r>
+              <w:t>String</w:t>
+            </w:r>
+          </w:p>
+        </w:tc>
+        <w:tc>
+          <w:tcPr>
+            <w:tcW w:w="5041" w:type="dxa"/>
+          </w:tcPr>
+          <w:p>
+            <w:r>
+              <w:t xml:space="preserve">Contains the exact line of </w:t>
+            </w:r>
+            <w:proofErr w:type="spellStart"/>
+            <w:r>
+              <w:t>GCode</w:t>
+            </w:r>
+            <w:proofErr w:type="spellEnd"/>
+            <w:r>
+              <w:t xml:space="preserve"> to be send via serial port</w:t>
+            </w:r>
+            <w:r>
+              <w:t>. Used in Send to serial port function</w:t>
+            </w:r>
+          </w:p>
+        </w:tc>
+      </w:tr>
+      <w:tr>
+        <w:trPr>
+          <w:trHeight w:val="547"/>
+        </w:trPr>
+        <w:tc>
+          <w:tcPr>
+            <w:tcW w:w="2136" w:type="dxa"/>
+          </w:tcPr>
           <w:p/>
         </w:tc>
         <w:tc>
@@ -913,7 +1116,6 @@
         </w:tc>
       </w:tr>
     </w:tbl>
-    <w:p/>
     <w:p>
       <w:pPr>
         <w:pStyle w:val="Heading1"/>
@@ -956,7 +1158,49 @@
         <w:rPr>
           <w:lang w:val="fr-FR"/>
         </w:rPr>
-        <w:t>Int GetCharLocation( int NumFont, fi</w:t>
+        <w:t xml:space="preserve">Int </w:t>
+      </w:r>
+      <w:proofErr w:type="spellStart"/>
+      <w:r>
+        <w:rPr>
+          <w:lang w:val="fr-FR"/>
+        </w:rPr>
+        <w:t>GetCharLocation</w:t>
+      </w:r>
+      <w:proofErr w:type="spellEnd"/>
+      <w:r>
+        <w:rPr>
+          <w:lang w:val="fr-FR"/>
+        </w:rPr>
+        <w:t xml:space="preserve">( </w:t>
+      </w:r>
+      <w:proofErr w:type="spellStart"/>
+      <w:r>
+        <w:rPr>
+          <w:lang w:val="fr-FR"/>
+        </w:rPr>
+        <w:t>int</w:t>
+      </w:r>
+      <w:proofErr w:type="spellEnd"/>
+      <w:r>
+        <w:rPr>
+          <w:lang w:val="fr-FR"/>
+        </w:rPr>
+        <w:t xml:space="preserve"> </w:t>
+      </w:r>
+      <w:proofErr w:type="spellStart"/>
+      <w:r>
+        <w:rPr>
+          <w:lang w:val="fr-FR"/>
+        </w:rPr>
+        <w:t>NumFont</w:t>
+      </w:r>
+      <w:proofErr w:type="spellEnd"/>
+      <w:r>
+        <w:rPr>
+          <w:lang w:val="fr-FR"/>
+        </w:rPr>
+        <w:t>, fi</w:t>
       </w:r>
       <w:r>
         <w:rPr>
@@ -975,7 +1219,35 @@
         <w:rPr>
           <w:lang w:val="fr-FR"/>
         </w:rPr>
-        <w:t>, int *CharLocation)</w:t>
+        <w:t xml:space="preserve">, </w:t>
+      </w:r>
+      <w:proofErr w:type="spellStart"/>
+      <w:r>
+        <w:rPr>
+          <w:lang w:val="fr-FR"/>
+        </w:rPr>
+        <w:t>int</w:t>
+      </w:r>
+      <w:proofErr w:type="spellEnd"/>
+      <w:r>
+        <w:rPr>
+          <w:lang w:val="fr-FR"/>
+        </w:rPr>
+        <w:t xml:space="preserve"> *</w:t>
+      </w:r>
+      <w:proofErr w:type="spellStart"/>
+      <w:r>
+        <w:rPr>
+          <w:lang w:val="fr-FR"/>
+        </w:rPr>
+        <w:t>CharLocation</w:t>
+      </w:r>
+      <w:proofErr w:type="spellEnd"/>
+      <w:r>
+        <w:rPr>
+          <w:lang w:val="fr-FR"/>
+        </w:rPr>
+        <w:t>)</w:t>
       </w:r>
     </w:p>
     <w:p>
@@ -987,8 +1259,13 @@
       <w:r>
         <w:tab/>
       </w:r>
-      <w:r>
-        <w:t>NumFont – inputs the length o</w:t>
+      <w:proofErr w:type="spellStart"/>
+      <w:r>
+        <w:t>NumFont</w:t>
+      </w:r>
+      <w:proofErr w:type="spellEnd"/>
+      <w:r>
+        <w:t xml:space="preserve"> – inputs the length o</w:t>
       </w:r>
       <w:r>
         <w:t>f the Font.txt used in for loop</w:t>
@@ -1009,8 +1286,29 @@
       <w:pPr>
         <w:ind w:left="720"/>
       </w:pPr>
-      <w:r>
-        <w:t>CharLocation – Pointer to the output array which states the locations each character starst at in CharGCode()</w:t>
+      <w:proofErr w:type="spellStart"/>
+      <w:r>
+        <w:t>CharLocation</w:t>
+      </w:r>
+      <w:proofErr w:type="spellEnd"/>
+      <w:r>
+        <w:t xml:space="preserve"> – Pointer to the output array which states the locations each character </w:t>
+      </w:r>
+      <w:proofErr w:type="spellStart"/>
+      <w:r>
+        <w:t>starst</w:t>
+      </w:r>
+      <w:proofErr w:type="spellEnd"/>
+      <w:r>
+        <w:t xml:space="preserve"> at in </w:t>
+      </w:r>
+      <w:proofErr w:type="spellStart"/>
+      <w:r>
+        <w:t>CharGCode</w:t>
+      </w:r>
+      <w:proofErr w:type="spellEnd"/>
+      <w:r>
+        <w:t>()</w:t>
       </w:r>
     </w:p>
     <w:p>
@@ -1039,7 +1337,49 @@
         <w:rPr>
           <w:lang w:val="fr-FR"/>
         </w:rPr>
-        <w:t xml:space="preserve">Int FormatAndScaleFontData( int NumFont, file </w:t>
+        <w:t xml:space="preserve">Int </w:t>
+      </w:r>
+      <w:proofErr w:type="spellStart"/>
+      <w:r>
+        <w:rPr>
+          <w:lang w:val="fr-FR"/>
+        </w:rPr>
+        <w:t>FormatAndScaleFontData</w:t>
+      </w:r>
+      <w:proofErr w:type="spellEnd"/>
+      <w:r>
+        <w:rPr>
+          <w:lang w:val="fr-FR"/>
+        </w:rPr>
+        <w:t xml:space="preserve">( </w:t>
+      </w:r>
+      <w:proofErr w:type="spellStart"/>
+      <w:r>
+        <w:rPr>
+          <w:lang w:val="fr-FR"/>
+        </w:rPr>
+        <w:t>int</w:t>
+      </w:r>
+      <w:proofErr w:type="spellEnd"/>
+      <w:r>
+        <w:rPr>
+          <w:lang w:val="fr-FR"/>
+        </w:rPr>
+        <w:t xml:space="preserve"> </w:t>
+      </w:r>
+      <w:proofErr w:type="spellStart"/>
+      <w:r>
+        <w:rPr>
+          <w:lang w:val="fr-FR"/>
+        </w:rPr>
+        <w:t>NumFont</w:t>
+      </w:r>
+      <w:proofErr w:type="spellEnd"/>
+      <w:r>
+        <w:rPr>
+          <w:lang w:val="fr-FR"/>
+        </w:rPr>
+        <w:t xml:space="preserve">, file </w:t>
       </w:r>
       <w:r>
         <w:rPr>
@@ -1052,7 +1392,63 @@
         <w:rPr>
           <w:lang w:val="fr-FR"/>
         </w:rPr>
-        <w:t>, int FontSize, int *CharGCode())</w:t>
+        <w:t xml:space="preserve">, </w:t>
+      </w:r>
+      <w:proofErr w:type="spellStart"/>
+      <w:r>
+        <w:rPr>
+          <w:lang w:val="fr-FR"/>
+        </w:rPr>
+        <w:t>int</w:t>
+      </w:r>
+      <w:proofErr w:type="spellEnd"/>
+      <w:r>
+        <w:rPr>
+          <w:lang w:val="fr-FR"/>
+        </w:rPr>
+        <w:t xml:space="preserve"> </w:t>
+      </w:r>
+      <w:proofErr w:type="spellStart"/>
+      <w:r>
+        <w:rPr>
+          <w:lang w:val="fr-FR"/>
+        </w:rPr>
+        <w:t>FontSize</w:t>
+      </w:r>
+      <w:proofErr w:type="spellEnd"/>
+      <w:r>
+        <w:rPr>
+          <w:lang w:val="fr-FR"/>
+        </w:rPr>
+        <w:t xml:space="preserve">, </w:t>
+      </w:r>
+      <w:proofErr w:type="spellStart"/>
+      <w:r>
+        <w:rPr>
+          <w:lang w:val="fr-FR"/>
+        </w:rPr>
+        <w:t>int</w:t>
+      </w:r>
+      <w:proofErr w:type="spellEnd"/>
+      <w:r>
+        <w:rPr>
+          <w:lang w:val="fr-FR"/>
+        </w:rPr>
+        <w:t xml:space="preserve"> *</w:t>
+      </w:r>
+      <w:proofErr w:type="spellStart"/>
+      <w:r>
+        <w:rPr>
+          <w:lang w:val="fr-FR"/>
+        </w:rPr>
+        <w:t>CharGCode</w:t>
+      </w:r>
+      <w:proofErr w:type="spellEnd"/>
+      <w:r>
+        <w:rPr>
+          <w:lang w:val="fr-FR"/>
+        </w:rPr>
+        <w:t>())</w:t>
       </w:r>
     </w:p>
     <w:p>
@@ -1064,8 +1460,13 @@
       <w:r>
         <w:tab/>
       </w:r>
-      <w:r>
-        <w:t>NumFont – inputs the length o</w:t>
+      <w:proofErr w:type="spellStart"/>
+      <w:r>
+        <w:t>NumFont</w:t>
+      </w:r>
+      <w:proofErr w:type="spellEnd"/>
+      <w:r>
+        <w:t xml:space="preserve"> – inputs the length o</w:t>
       </w:r>
       <w:r>
         <w:t>f the Font.txt used in for loop</w:t>
@@ -1086,16 +1487,42 @@
       <w:pPr>
         <w:ind w:firstLine="720"/>
       </w:pPr>
-      <w:r>
-        <w:t>FontSize – inputs the FontSize determined by the user</w:t>
+      <w:proofErr w:type="spellStart"/>
+      <w:r>
+        <w:t>FontSize</w:t>
+      </w:r>
+      <w:proofErr w:type="spellEnd"/>
+      <w:r>
+        <w:t xml:space="preserve"> – inputs the </w:t>
+      </w:r>
+      <w:proofErr w:type="spellStart"/>
+      <w:r>
+        <w:t>FontSize</w:t>
+      </w:r>
+      <w:proofErr w:type="spellEnd"/>
+      <w:r>
+        <w:t xml:space="preserve"> determined by the user</w:t>
       </w:r>
     </w:p>
     <w:p>
       <w:pPr>
         <w:ind w:firstLine="720"/>
       </w:pPr>
-      <w:r>
-        <w:t>CharGCode() – pointer to the output array which contains the GCode for each character</w:t>
+      <w:proofErr w:type="spellStart"/>
+      <w:r>
+        <w:t>CharGCode</w:t>
+      </w:r>
+      <w:proofErr w:type="spellEnd"/>
+      <w:r>
+        <w:t xml:space="preserve">() – pointer to the output array which contains the </w:t>
+      </w:r>
+      <w:proofErr w:type="spellStart"/>
+      <w:r>
+        <w:t>GCode</w:t>
+      </w:r>
+      <w:proofErr w:type="spellEnd"/>
+      <w:r>
+        <w:t xml:space="preserve"> for each character</w:t>
       </w:r>
     </w:p>
     <w:p>
@@ -1116,16 +1543,35 @@
     </w:p>
     <w:p>
       <w:r>
-        <w:t xml:space="preserve">Int SeperateWords(  file </w:t>
-      </w:r>
-      <w:r>
-        <w:rPr>
-          <w:color w:val="EE0000"/>
-        </w:rPr>
-        <w:t>*words.txt</w:t>
-      </w:r>
-      <w:r>
-        <w:t>, Char *WordContents() )</w:t>
+        <w:t xml:space="preserve">Int </w:t>
+      </w:r>
+      <w:proofErr w:type="spellStart"/>
+      <w:r>
+        <w:t>SeperateWords</w:t>
+      </w:r>
+      <w:proofErr w:type="spellEnd"/>
+      <w:r>
+        <w:t xml:space="preserve">(  </w:t>
+      </w:r>
+      <w:r>
+        <w:t>file *</w:t>
+      </w:r>
+      <w:r>
+        <w:t>SingleStrokeFont</w:t>
+      </w:r>
+      <w:r>
+        <w:t>.txt</w:t>
+      </w:r>
+      <w:r>
+        <w:t>, Char *</w:t>
+      </w:r>
+      <w:proofErr w:type="spellStart"/>
+      <w:r>
+        <w:t>WordContents</w:t>
+      </w:r>
+      <w:proofErr w:type="spellEnd"/>
+      <w:r>
+        <w:t>() )</w:t>
       </w:r>
     </w:p>
     <w:p>
@@ -1143,8 +1589,13 @@
       <w:pPr>
         <w:ind w:left="720"/>
       </w:pPr>
-      <w:r>
-        <w:t>WordContents() – Pointer to the output array which has separated all characters for each word in array.</w:t>
+      <w:proofErr w:type="spellStart"/>
+      <w:r>
+        <w:t>WordContents</w:t>
+      </w:r>
+      <w:proofErr w:type="spellEnd"/>
+      <w:r>
+        <w:t>() – Pointer to the output array which has separated all characters for each word in array.</w:t>
       </w:r>
     </w:p>
     <w:p>
@@ -1167,20 +1618,49 @@
       <w:r>
         <w:t xml:space="preserve">Int </w:t>
       </w:r>
-      <w:r>
-        <w:t>WordToGCodeandSend(</w:t>
+      <w:proofErr w:type="spellStart"/>
+      <w:r>
+        <w:t>WordToGCodeandSend</w:t>
+      </w:r>
+      <w:proofErr w:type="spellEnd"/>
+      <w:r>
+        <w:t>(</w:t>
       </w:r>
       <w:r>
         <w:t xml:space="preserve"> </w:t>
       </w:r>
       <w:r>
-        <w:t xml:space="preserve">char *WordContents(), </w:t>
-      </w:r>
-      <w:r>
-        <w:t xml:space="preserve">double *CharGCode(), </w:t>
-      </w:r>
-      <w:r>
-        <w:t>int *CharLocation())</w:t>
+        <w:t>char *</w:t>
+      </w:r>
+      <w:proofErr w:type="spellStart"/>
+      <w:r>
+        <w:t>WordContents</w:t>
+      </w:r>
+      <w:proofErr w:type="spellEnd"/>
+      <w:r>
+        <w:t xml:space="preserve">(), </w:t>
+      </w:r>
+      <w:r>
+        <w:t>double *</w:t>
+      </w:r>
+      <w:proofErr w:type="spellStart"/>
+      <w:r>
+        <w:t>CharGCode</w:t>
+      </w:r>
+      <w:proofErr w:type="spellEnd"/>
+      <w:r>
+        <w:t xml:space="preserve">(), </w:t>
+      </w:r>
+      <w:r>
+        <w:t>int *</w:t>
+      </w:r>
+      <w:proofErr w:type="spellStart"/>
+      <w:r>
+        <w:t>CharLocation</w:t>
+      </w:r>
+      <w:proofErr w:type="spellEnd"/>
+      <w:r>
+        <w:t>())</w:t>
       </w:r>
     </w:p>
     <w:p>
@@ -1192,8 +1672,13 @@
       <w:r>
         <w:tab/>
       </w:r>
-      <w:r>
-        <w:t xml:space="preserve">WordContents() </w:t>
+      <w:proofErr w:type="spellStart"/>
+      <w:r>
+        <w:t>WordContents</w:t>
+      </w:r>
+      <w:proofErr w:type="spellEnd"/>
+      <w:r>
+        <w:t xml:space="preserve">() </w:t>
       </w:r>
       <w:r>
         <w:t>–</w:t>
@@ -1208,7 +1693,22 @@
     <w:p>
       <w:r>
         <w:tab/>
-        <w:t>CharGCode() – inputs the array containing the GCode for each character</w:t>
+      </w:r>
+      <w:proofErr w:type="spellStart"/>
+      <w:r>
+        <w:t>CharGCode</w:t>
+      </w:r>
+      <w:proofErr w:type="spellEnd"/>
+      <w:r>
+        <w:t xml:space="preserve">() – inputs the array containing the </w:t>
+      </w:r>
+      <w:proofErr w:type="spellStart"/>
+      <w:r>
+        <w:t>GCode</w:t>
+      </w:r>
+      <w:proofErr w:type="spellEnd"/>
+      <w:r>
+        <w:t xml:space="preserve"> for each character</w:t>
       </w:r>
     </w:p>
     <w:p>
@@ -1219,15 +1719,36 @@
           <w:szCs w:val="18"/>
         </w:rPr>
       </w:pPr>
-      <w:r>
-        <w:t xml:space="preserve">CharLocation() – </w:t>
+      <w:proofErr w:type="spellStart"/>
+      <w:r>
+        <w:t>CharLocation</w:t>
+      </w:r>
+      <w:proofErr w:type="spellEnd"/>
+      <w:r>
+        <w:t xml:space="preserve">() – </w:t>
       </w:r>
       <w:r>
         <w:rPr>
           <w:sz w:val="20"/>
           <w:szCs w:val="18"/>
         </w:rPr>
-        <w:t>inputs the array containing the location of each character within  CharGCode()</w:t>
+        <w:t xml:space="preserve">inputs the array containing the location of each character within  </w:t>
+      </w:r>
+      <w:proofErr w:type="spellStart"/>
+      <w:r>
+        <w:rPr>
+          <w:sz w:val="20"/>
+          <w:szCs w:val="18"/>
+        </w:rPr>
+        <w:t>CharGCode</w:t>
+      </w:r>
+      <w:proofErr w:type="spellEnd"/>
+      <w:r>
+        <w:rPr>
+          <w:sz w:val="20"/>
+          <w:szCs w:val="18"/>
+        </w:rPr>
+        <w:t>()</w:t>
       </w:r>
     </w:p>
     <w:p>
@@ -1243,27 +1764,39 @@
     </w:p>
     <w:p>
       <w:r>
-        <w:t xml:space="preserve">Int SendToRobot( </w:t>
+        <w:t xml:space="preserve">Int </w:t>
+      </w:r>
+      <w:proofErr w:type="spellStart"/>
+      <w:r>
+        <w:t>SendToRobot</w:t>
+      </w:r>
+      <w:proofErr w:type="spellEnd"/>
+      <w:r>
+        <w:t xml:space="preserve">( </w:t>
       </w:r>
       <w:r>
         <w:t xml:space="preserve">Double </w:t>
       </w:r>
-      <w:r>
-        <w:t>CurrentWordGCode()</w:t>
-      </w:r>
-      <w:r>
-        <w:t>)</w:t>
+      <w:proofErr w:type="spellStart"/>
+      <w:r>
+        <w:t>CurrentWordGCode</w:t>
+      </w:r>
+      <w:proofErr w:type="spellEnd"/>
+      <w:r>
+        <w:t>())</w:t>
       </w:r>
     </w:p>
     <w:p>
       <w:pPr>
         <w:ind w:left="720"/>
       </w:pPr>
-      <w:r>
-        <w:t>CurrentWordGCode()</w:t>
-      </w:r>
-      <w:r>
-        <w:t xml:space="preserve"> – inputs the current chunk of instructions to be converted to serial </w:t>
+      <w:proofErr w:type="spellStart"/>
+      <w:r>
+        <w:t>CurrentWordGCode</w:t>
+      </w:r>
+      <w:proofErr w:type="spellEnd"/>
+      <w:r>
+        <w:t xml:space="preserve">() – inputs the current chunk of instructions to be converted to serial </w:t>
       </w:r>
       <w:r>
         <w:t>and sent to robot</w:t>
@@ -1369,7 +1902,10 @@
           </w:tcPr>
           <w:p>
             <w:r>
-              <w:t>Main()</w:t>
+              <w:t>Main</w:t>
+            </w:r>
+            <w:r>
+              <w:t>()</w:t>
             </w:r>
           </w:p>
         </w:tc>
@@ -1401,13 +1937,18 @@
             <w:tcW w:w="2019" w:type="dxa"/>
           </w:tcPr>
           <w:p>
+            <w:proofErr w:type="spellStart"/>
             <w:r>
               <w:rPr>
                 <w:lang w:val="fr-FR"/>
               </w:rPr>
               <w:t>GetCharLocation</w:t>
             </w:r>
-            <w:r>
+            <w:proofErr w:type="spellEnd"/>
+            <w:r>
+              <w:rPr>
+                <w:lang w:val="fr-FR"/>
+              </w:rPr>
               <w:t>()</w:t>
             </w:r>
           </w:p>
@@ -1440,12 +1981,14 @@
             <w:tcW w:w="2019" w:type="dxa"/>
           </w:tcPr>
           <w:p>
+            <w:proofErr w:type="spellStart"/>
             <w:r>
               <w:rPr>
                 <w:lang w:val="fr-FR"/>
               </w:rPr>
               <w:t>FormatAndScaleFontData</w:t>
             </w:r>
+            <w:proofErr w:type="spellEnd"/>
             <w:r>
               <w:rPr>
                 <w:lang w:val="fr-FR"/>
@@ -1482,8 +2025,13 @@
             <w:tcW w:w="2019" w:type="dxa"/>
           </w:tcPr>
           <w:p>
-            <w:r>
-              <w:t>SeperateWords()</w:t>
+            <w:proofErr w:type="spellStart"/>
+            <w:r>
+              <w:t>SeperateWords</w:t>
+            </w:r>
+            <w:proofErr w:type="spellEnd"/>
+            <w:r>
+              <w:t>()</w:t>
             </w:r>
           </w:p>
         </w:tc>
@@ -1515,8 +2063,13 @@
             <w:tcW w:w="2019" w:type="dxa"/>
           </w:tcPr>
           <w:p>
-            <w:r>
-              <w:t>WordToGCodeandSend()</w:t>
+            <w:proofErr w:type="spellStart"/>
+            <w:r>
+              <w:t>WordToGCodeandSend</w:t>
+            </w:r>
+            <w:proofErr w:type="spellEnd"/>
+            <w:r>
+              <w:t>()</w:t>
             </w:r>
           </w:p>
         </w:tc>
@@ -1548,11 +2101,16 @@
             <w:tcW w:w="2019" w:type="dxa"/>
           </w:tcPr>
           <w:p>
+            <w:proofErr w:type="spellStart"/>
             <w:r>
               <w:t>Send</w:t>
             </w:r>
             <w:r>
-              <w:t>ToRobot()</w:t>
+              <w:t>ToRobot</w:t>
+            </w:r>
+            <w:proofErr w:type="spellEnd"/>
+            <w:r>
+              <w:t>()</w:t>
             </w:r>
           </w:p>
         </w:tc>
@@ -1567,8 +2125,13 @@
             <w:tcW w:w="2533" w:type="dxa"/>
           </w:tcPr>
           <w:p>
-            <w:r>
-              <w:t>CurentWordGCode()</w:t>
+            <w:proofErr w:type="spellStart"/>
+            <w:r>
+              <w:t>CurentWordGCode</w:t>
+            </w:r>
+            <w:proofErr w:type="spellEnd"/>
+            <w:r>
+              <w:t>()</w:t>
             </w:r>
           </w:p>
         </w:tc>
@@ -1581,10 +2144,23 @@
               <w:t xml:space="preserve">Robot </w:t>
             </w:r>
             <w:r>
-              <w:t xml:space="preserve">receives all data and “writes” the GCode in </w:t>
-            </w:r>
-            <w:r>
-              <w:t>CurentWordGCode()</w:t>
+              <w:t xml:space="preserve">receives all data and “writes” the </w:t>
+            </w:r>
+            <w:proofErr w:type="spellStart"/>
+            <w:r>
+              <w:t>GCode</w:t>
+            </w:r>
+            <w:proofErr w:type="spellEnd"/>
+            <w:r>
+              <w:t xml:space="preserve"> in </w:t>
+            </w:r>
+            <w:proofErr w:type="spellStart"/>
+            <w:r>
+              <w:t>CurentWordGCode</w:t>
+            </w:r>
+            <w:proofErr w:type="spellEnd"/>
+            <w:r>
+              <w:t>()</w:t>
             </w:r>
           </w:p>
         </w:tc>
@@ -1631,7 +2207,7 @@
     </w:p>
     <w:p>
       <w:r>
-        <w:t>May be included as separate pdf</w:t>
+        <w:t>These are in separate PDF’s</w:t>
       </w:r>
     </w:p>
     <w:p>
@@ -2397,6 +2973,7 @@
   <w:style w:type="character" w:default="1" w:styleId="DefaultParagraphFont">
     <w:name w:val="Default Paragraph Font"/>
     <w:uiPriority w:val="1"/>
+    <w:semiHidden/>
     <w:unhideWhenUsed/>
   </w:style>
   <w:style w:type="table" w:default="1" w:styleId="TableNormal">

</xml_diff>

<commit_message>
Added PDF's and finalised Planning document
</commit_message>
<xml_diff>
--- a/ProjectPlanning egyeb12.docx
+++ b/ProjectPlanning egyeb12.docx
@@ -33,12 +33,36 @@
     </w:p>
     <w:p>
       <w:r>
-        <w:t>The Code initially opens and reads a txt file containing the font data and gets a user input for the font size. Using the font G code data and size the positions and code for each character in the txt file is translated to the correct format and scaled, before being stored in an array (WordGCode()). Each letter can be accessed from x position in the array, where x is the starting location for each character which is determined by a for loop and the positions are stored in a different array (CharLocation()).</w:t>
-      </w:r>
-    </w:p>
-    <w:p>
-      <w:r>
-        <w:t>The txt file containing the text to be "written" is then opened, and each word is separated and stored in separate columns of an array  (WordContents()). The initial conditions for the robot are then generated and sent (spindle on, pen up and position at 0,0).</w:t>
+        <w:t>The Code initially opens and reads a txt file containing the font data and gets a user input for the font size. Using the font G code data and size the positions and code for each character in the txt file is translated to the correct format and scaled, before being stored in an array (</w:t>
+      </w:r>
+      <w:proofErr w:type="spellStart"/>
+      <w:r>
+        <w:t>WordGCode</w:t>
+      </w:r>
+      <w:proofErr w:type="spellEnd"/>
+      <w:r>
+        <w:t>()). Each letter can be accessed from x position in the array, where x is the starting location for each character which is determined by a for loop and the positions are stored in a different array (</w:t>
+      </w:r>
+      <w:proofErr w:type="spellStart"/>
+      <w:r>
+        <w:t>CharLocation</w:t>
+      </w:r>
+      <w:proofErr w:type="spellEnd"/>
+      <w:r>
+        <w:t>()).</w:t>
+      </w:r>
+    </w:p>
+    <w:p>
+      <w:r>
+        <w:t>The txt file containing the text to be "written" is then opened, and each word is separated and stored in separate columns of an array  (</w:t>
+      </w:r>
+      <w:proofErr w:type="spellStart"/>
+      <w:r>
+        <w:t>WordContents</w:t>
+      </w:r>
+      <w:proofErr w:type="spellEnd"/>
+      <w:r>
+        <w:t>()). The initial conditions for the robot are then generated and sent (spindle on, pen up and position at 0,0).</w:t>
       </w:r>
     </w:p>
     <w:p>
@@ -51,7 +75,15 @@
         <w:ind w:left="720"/>
       </w:pPr>
       <w:r>
-        <w:t>1. The x and y starting positions determined (if the word length + current words in line are greater than the maximum x space on page a new line is made and the word starts on the new line (change in y)) (x position is then determined as if its on a new line it is 0 and if its carrying on from the last word it is the ending x point of the last word plus a gap)</w:t>
+        <w:t xml:space="preserve">1. The x and y starting positions determined (if the word length + current words in line are greater than the maximum x space on page a new line is made and the word starts on the new line (change in y)) (x position is then determined as if </w:t>
+      </w:r>
+      <w:proofErr w:type="spellStart"/>
+      <w:r>
+        <w:t>its</w:t>
+      </w:r>
+      <w:proofErr w:type="spellEnd"/>
+      <w:r>
+        <w:t xml:space="preserve"> on a new line it is 0 and if its carrying on from the last word it is the ending x point of the last word plus a gap)</w:t>
       </w:r>
     </w:p>
     <w:p>
@@ -66,7 +98,15 @@
       </w:r>
       <w:r>
         <w:tab/>
-        <w:t>a. The character is read and the location of the G code in WordGCode() is found</w:t>
+        <w:t xml:space="preserve">a. The character is read and the location of the G code in </w:t>
+      </w:r>
+      <w:proofErr w:type="spellStart"/>
+      <w:r>
+        <w:t>WordGCode</w:t>
+      </w:r>
+      <w:proofErr w:type="spellEnd"/>
+      <w:r>
+        <w:t>() is found</w:t>
       </w:r>
     </w:p>
     <w:p>
@@ -74,7 +114,15 @@
         <w:ind w:left="1440"/>
       </w:pPr>
       <w:r>
-        <w:t>b. From the x and y starting point the Gcode is loaded in from the file and the x and y starting positions are added to all lines of the code for that character.</w:t>
+        <w:t xml:space="preserve">b. From the x and y starting point the </w:t>
+      </w:r>
+      <w:proofErr w:type="spellStart"/>
+      <w:r>
+        <w:t>Gcode</w:t>
+      </w:r>
+      <w:proofErr w:type="spellEnd"/>
+      <w:r>
+        <w:t xml:space="preserve"> is loaded in from the file and the x and y starting positions are added to all lines of the code for that character.</w:t>
       </w:r>
     </w:p>
     <w:p>
@@ -82,7 +130,15 @@
         <w:ind w:left="1440"/>
       </w:pPr>
       <w:r>
-        <w:t>c. The data is formatted into the exact G code style needed and stored in        CurrentWordGCode()</w:t>
+        <w:t xml:space="preserve">c. The data is formatted into the exact G code style needed and stored in        </w:t>
+      </w:r>
+      <w:proofErr w:type="spellStart"/>
+      <w:r>
+        <w:t>CurrentWordGCode</w:t>
+      </w:r>
+      <w:proofErr w:type="spellEnd"/>
+      <w:r>
+        <w:t>()</w:t>
       </w:r>
     </w:p>
     <w:p>
@@ -107,7 +163,15 @@
         <w:ind w:left="720"/>
       </w:pPr>
       <w:r>
-        <w:t>4. The CurrentWordGCode() data is processed into the correct data channels and sent to the robot.</w:t>
+        <w:t xml:space="preserve">4. The </w:t>
+      </w:r>
+      <w:proofErr w:type="spellStart"/>
+      <w:r>
+        <w:t>CurrentWordGCode</w:t>
+      </w:r>
+      <w:proofErr w:type="spellEnd"/>
+      <w:r>
+        <w:t>() data is processed into the correct data channels and sent to the robot.</w:t>
       </w:r>
     </w:p>
     <w:p>
@@ -149,9 +213,9 @@
         <w:tblLook w:val="04A0" w:firstRow="1" w:lastRow="0" w:firstColumn="1" w:lastColumn="0" w:noHBand="0" w:noVBand="1"/>
       </w:tblPr>
       <w:tblGrid>
-        <w:gridCol w:w="2136"/>
-        <w:gridCol w:w="1839"/>
-        <w:gridCol w:w="5041"/>
+        <w:gridCol w:w="2505"/>
+        <w:gridCol w:w="1767"/>
+        <w:gridCol w:w="4744"/>
       </w:tblGrid>
       <w:tr>
         <w:tc>
@@ -217,8 +281,13 @@
             <w:tcW w:w="2136" w:type="dxa"/>
           </w:tcPr>
           <w:p>
-            <w:r>
-              <w:t>WordContents()</w:t>
+            <w:proofErr w:type="spellStart"/>
+            <w:r>
+              <w:t>WordContents</w:t>
+            </w:r>
+            <w:proofErr w:type="spellEnd"/>
+            <w:r>
+              <w:t>()</w:t>
             </w:r>
           </w:p>
         </w:tc>
@@ -258,8 +327,13 @@
             <w:tcW w:w="2136" w:type="dxa"/>
           </w:tcPr>
           <w:p>
-            <w:r>
-              <w:t>CharGCode()</w:t>
+            <w:proofErr w:type="spellStart"/>
+            <w:r>
+              <w:t>CharGCode</w:t>
+            </w:r>
+            <w:proofErr w:type="spellEnd"/>
+            <w:r>
+              <w:t>()</w:t>
             </w:r>
           </w:p>
         </w:tc>
@@ -311,9 +385,11 @@
             <w:tcW w:w="2136" w:type="dxa"/>
           </w:tcPr>
           <w:p>
+            <w:proofErr w:type="spellStart"/>
             <w:r>
               <w:t>CharLocation</w:t>
             </w:r>
+            <w:proofErr w:type="spellEnd"/>
             <w:r>
               <w:t>()</w:t>
             </w:r>
@@ -343,9 +419,11 @@
             <w:r>
               <w:t xml:space="preserve">the </w:t>
             </w:r>
+            <w:proofErr w:type="spellStart"/>
             <w:r>
               <w:t>CharGCode</w:t>
             </w:r>
+            <w:proofErr w:type="spellEnd"/>
             <w:r>
               <w:t>() array for easy lookup for every character</w:t>
             </w:r>
@@ -361,8 +439,19 @@
             <w:tcW w:w="2136" w:type="dxa"/>
           </w:tcPr>
           <w:p>
-            <w:r>
-              <w:t>CurrentWordGCode()</w:t>
+            <w:proofErr w:type="spellStart"/>
+            <w:r>
+              <w:t>Current</w:t>
+            </w:r>
+            <w:r>
+              <w:t>Character</w:t>
+            </w:r>
+            <w:r>
+              <w:t>GCode</w:t>
+            </w:r>
+            <w:proofErr w:type="spellEnd"/>
+            <w:r>
+              <w:t>()</w:t>
             </w:r>
           </w:p>
         </w:tc>
@@ -385,7 +474,21 @@
           </w:tcPr>
           <w:p>
             <w:r>
-              <w:t xml:space="preserve">Holds all the GCode for each character of the current word that is being sent to the robot which will later be converted to serial and sent </w:t>
+              <w:t xml:space="preserve">Holds all the </w:t>
+            </w:r>
+            <w:proofErr w:type="spellStart"/>
+            <w:r>
+              <w:t>GCode</w:t>
+            </w:r>
+            <w:proofErr w:type="spellEnd"/>
+            <w:r>
+              <w:t xml:space="preserve"> for </w:t>
+            </w:r>
+            <w:r>
+              <w:t>the character</w:t>
+            </w:r>
+            <w:r>
+              <w:t xml:space="preserve"> that is being sent to the robot which will later be converted to serial and sent </w:t>
             </w:r>
           </w:p>
         </w:tc>
@@ -419,9 +522,11 @@
             <w:tcW w:w="2136" w:type="dxa"/>
           </w:tcPr>
           <w:p>
+            <w:proofErr w:type="spellStart"/>
             <w:r>
               <w:t>Xpos</w:t>
             </w:r>
+            <w:proofErr w:type="spellEnd"/>
           </w:p>
         </w:tc>
         <w:tc>
@@ -440,8 +545,13 @@
           </w:tcPr>
           <w:p>
             <w:r>
-              <w:t>X position of the pen for each section of Gcode</w:t>
-            </w:r>
+              <w:t xml:space="preserve">X position of the pen for each section of </w:t>
+            </w:r>
+            <w:proofErr w:type="spellStart"/>
+            <w:r>
+              <w:t>Gcode</w:t>
+            </w:r>
+            <w:proofErr w:type="spellEnd"/>
           </w:p>
         </w:tc>
       </w:tr>
@@ -454,9 +564,11 @@
             <w:tcW w:w="2136" w:type="dxa"/>
           </w:tcPr>
           <w:p>
+            <w:proofErr w:type="spellStart"/>
             <w:r>
               <w:t>Ypos</w:t>
             </w:r>
+            <w:proofErr w:type="spellEnd"/>
           </w:p>
         </w:tc>
         <w:tc>
@@ -475,8 +587,13 @@
           </w:tcPr>
           <w:p>
             <w:r>
-              <w:t>Y position of the pen for each section of Gcode</w:t>
-            </w:r>
+              <w:t xml:space="preserve">Y position of the pen for each section of </w:t>
+            </w:r>
+            <w:proofErr w:type="spellStart"/>
+            <w:r>
+              <w:t>Gcode</w:t>
+            </w:r>
+            <w:proofErr w:type="spellEnd"/>
           </w:p>
         </w:tc>
       </w:tr>
@@ -489,9 +606,11 @@
             <w:tcW w:w="2136" w:type="dxa"/>
           </w:tcPr>
           <w:p>
+            <w:proofErr w:type="spellStart"/>
             <w:r>
               <w:t>Ppos</w:t>
             </w:r>
+            <w:proofErr w:type="spellEnd"/>
           </w:p>
         </w:tc>
         <w:tc>
@@ -524,9 +643,11 @@
             <w:tcW w:w="2136" w:type="dxa"/>
           </w:tcPr>
           <w:p>
+            <w:proofErr w:type="spellStart"/>
             <w:r>
               <w:t>Xspacing</w:t>
             </w:r>
+            <w:proofErr w:type="spellEnd"/>
           </w:p>
         </w:tc>
         <w:tc>
@@ -562,9 +683,11 @@
             <w:tcW w:w="2136" w:type="dxa"/>
           </w:tcPr>
           <w:p>
+            <w:proofErr w:type="spellStart"/>
             <w:r>
               <w:t>Yspacing</w:t>
             </w:r>
+            <w:proofErr w:type="spellEnd"/>
           </w:p>
         </w:tc>
         <w:tc>
@@ -600,9 +723,11 @@
             <w:tcW w:w="2136" w:type="dxa"/>
           </w:tcPr>
           <w:p>
+            <w:proofErr w:type="spellStart"/>
             <w:r>
               <w:t>Penspeed</w:t>
             </w:r>
+            <w:proofErr w:type="spellEnd"/>
           </w:p>
         </w:tc>
         <w:tc>
@@ -693,9 +818,11 @@
             <w:tcW w:w="2136" w:type="dxa"/>
           </w:tcPr>
           <w:p>
+            <w:proofErr w:type="spellStart"/>
             <w:r>
               <w:t>NumWords</w:t>
             </w:r>
+            <w:proofErr w:type="spellEnd"/>
           </w:p>
         </w:tc>
         <w:tc>
@@ -720,7 +847,15 @@
               <w:t xml:space="preserve">word contents </w:t>
             </w:r>
             <w:r>
-              <w:t>txt file used for for loops</w:t>
+              <w:t xml:space="preserve">txt file used for </w:t>
+            </w:r>
+            <w:proofErr w:type="spellStart"/>
+            <w:r>
+              <w:t>for</w:t>
+            </w:r>
+            <w:proofErr w:type="spellEnd"/>
+            <w:r>
+              <w:t xml:space="preserve"> loops</w:t>
             </w:r>
           </w:p>
         </w:tc>
@@ -734,9 +869,11 @@
             <w:tcW w:w="2136" w:type="dxa"/>
           </w:tcPr>
           <w:p>
+            <w:proofErr w:type="spellStart"/>
             <w:r>
               <w:t>NumLetters</w:t>
             </w:r>
+            <w:proofErr w:type="spellEnd"/>
           </w:p>
         </w:tc>
         <w:tc>
@@ -769,9 +906,11 @@
             <w:tcW w:w="2136" w:type="dxa"/>
           </w:tcPr>
           <w:p>
+            <w:proofErr w:type="spellStart"/>
             <w:r>
               <w:t>WordLength</w:t>
             </w:r>
+            <w:proofErr w:type="spellEnd"/>
           </w:p>
         </w:tc>
         <w:tc>
@@ -804,9 +943,11 @@
             <w:tcW w:w="2136" w:type="dxa"/>
           </w:tcPr>
           <w:p>
+            <w:proofErr w:type="spellStart"/>
             <w:r>
               <w:t>FontSize</w:t>
             </w:r>
+            <w:proofErr w:type="spellEnd"/>
           </w:p>
         </w:tc>
         <w:tc>
@@ -825,7 +966,15 @@
           </w:tcPr>
           <w:p>
             <w:r>
-              <w:t>User inputted font size to alter the GCode to size</w:t>
+              <w:t xml:space="preserve">User inputted font size to alter the </w:t>
+            </w:r>
+            <w:proofErr w:type="spellStart"/>
+            <w:r>
+              <w:t>GCode</w:t>
+            </w:r>
+            <w:proofErr w:type="spellEnd"/>
+            <w:r>
+              <w:t xml:space="preserve"> to size</w:t>
             </w:r>
           </w:p>
         </w:tc>
@@ -839,9 +988,11 @@
             <w:tcW w:w="2136" w:type="dxa"/>
           </w:tcPr>
           <w:p>
+            <w:proofErr w:type="spellStart"/>
             <w:r>
               <w:t>NumFont</w:t>
             </w:r>
+            <w:proofErr w:type="spellEnd"/>
           </w:p>
         </w:tc>
         <w:tc>
@@ -863,7 +1014,15 @@
               <w:t xml:space="preserve">Number of lines in </w:t>
             </w:r>
             <w:r>
-              <w:t>font txt file used for for loops</w:t>
+              <w:t xml:space="preserve">font txt file used for </w:t>
+            </w:r>
+            <w:proofErr w:type="spellStart"/>
+            <w:r>
+              <w:t>for</w:t>
+            </w:r>
+            <w:proofErr w:type="spellEnd"/>
+            <w:r>
+              <w:t xml:space="preserve"> loops</w:t>
             </w:r>
           </w:p>
         </w:tc>
@@ -897,9 +1056,11 @@
             <w:tcW w:w="2136" w:type="dxa"/>
           </w:tcPr>
           <w:p>
+            <w:proofErr w:type="spellStart"/>
             <w:r>
               <w:t>SerialSend</w:t>
             </w:r>
+            <w:proofErr w:type="spellEnd"/>
           </w:p>
         </w:tc>
         <w:tc>
@@ -918,7 +1079,15 @@
           </w:tcPr>
           <w:p>
             <w:r>
-              <w:t>Contains the exact line of GCode to be send via serial port</w:t>
+              <w:t xml:space="preserve">Contains the exact line of </w:t>
+            </w:r>
+            <w:proofErr w:type="spellStart"/>
+            <w:r>
+              <w:t>GCode</w:t>
+            </w:r>
+            <w:proofErr w:type="spellEnd"/>
+            <w:r>
+              <w:t xml:space="preserve"> to be send via serial port</w:t>
             </w:r>
             <w:r>
               <w:t>. Used in Send to serial port function</w:t>
@@ -955,7 +1124,6 @@
         <w:pStyle w:val="Heading1"/>
       </w:pPr>
       <w:r>
-        <w:lastRenderedPageBreak/>
         <w:t>Function Declarations</w:t>
       </w:r>
     </w:p>
@@ -983,31 +1151,38 @@
       </w:pPr>
     </w:p>
     <w:p>
-      <w:pPr>
-        <w:rPr>
-          <w:lang w:val="fr-FR"/>
-        </w:rPr>
-      </w:pPr>
-      <w:r>
-        <w:rPr>
-          <w:lang w:val="fr-FR"/>
-        </w:rPr>
-        <w:t>Int GetCharLocation( int NumFont, fi</w:t>
-      </w:r>
-      <w:r>
-        <w:rPr>
-          <w:lang w:val="fr-FR"/>
-        </w:rPr>
-        <w:t xml:space="preserve">le </w:t>
+      <w:r>
+        <w:t xml:space="preserve">Int </w:t>
+      </w:r>
+      <w:proofErr w:type="spellStart"/>
+      <w:r>
+        <w:t>GetCharLocation</w:t>
+      </w:r>
+      <w:proofErr w:type="spellEnd"/>
+      <w:r>
+        <w:t xml:space="preserve">( int </w:t>
+      </w:r>
+      <w:proofErr w:type="spellStart"/>
+      <w:r>
+        <w:t>NumFont</w:t>
+      </w:r>
+      <w:proofErr w:type="spellEnd"/>
+      <w:r>
+        <w:t xml:space="preserve">, file </w:t>
       </w:r>
       <w:r>
         <w:t>*SingleStrokeFont.txt</w:t>
       </w:r>
       <w:r>
-        <w:rPr>
-          <w:lang w:val="fr-FR"/>
-        </w:rPr>
-        <w:t>, int *CharLocation)</w:t>
+        <w:t>, int *</w:t>
+      </w:r>
+      <w:proofErr w:type="spellStart"/>
+      <w:r>
+        <w:t>CharLocation</w:t>
+      </w:r>
+      <w:proofErr w:type="spellEnd"/>
+      <w:r>
+        <w:t>)</w:t>
       </w:r>
     </w:p>
     <w:p>
@@ -1019,8 +1194,13 @@
       <w:r>
         <w:tab/>
       </w:r>
-      <w:r>
-        <w:t>NumFont – inputs the length o</w:t>
+      <w:proofErr w:type="spellStart"/>
+      <w:r>
+        <w:t>NumFont</w:t>
+      </w:r>
+      <w:proofErr w:type="spellEnd"/>
+      <w:r>
+        <w:t xml:space="preserve"> – inputs the length o</w:t>
       </w:r>
       <w:r>
         <w:t>f the Font.txt used in for loop</w:t>
@@ -1041,8 +1221,29 @@
       <w:pPr>
         <w:ind w:left="720"/>
       </w:pPr>
-      <w:r>
-        <w:t>CharLocation – Pointer to the output array which states the locations each character starst at in CharGCode()</w:t>
+      <w:proofErr w:type="spellStart"/>
+      <w:r>
+        <w:t>CharLocation</w:t>
+      </w:r>
+      <w:proofErr w:type="spellEnd"/>
+      <w:r>
+        <w:t xml:space="preserve"> – Pointer to the output array which states the locations each character </w:t>
+      </w:r>
+      <w:proofErr w:type="spellStart"/>
+      <w:r>
+        <w:t>starst</w:t>
+      </w:r>
+      <w:proofErr w:type="spellEnd"/>
+      <w:r>
+        <w:t xml:space="preserve"> at in </w:t>
+      </w:r>
+      <w:proofErr w:type="spellStart"/>
+      <w:r>
+        <w:t>CharGCode</w:t>
+      </w:r>
+      <w:proofErr w:type="spellEnd"/>
+      <w:r>
+        <w:t>()</w:t>
       </w:r>
     </w:p>
     <w:p>
@@ -1062,25 +1263,46 @@
       </w:pPr>
     </w:p>
     <w:p>
-      <w:pPr>
-        <w:rPr>
-          <w:lang w:val="fr-FR"/>
-        </w:rPr>
-      </w:pPr>
-      <w:r>
-        <w:rPr>
-          <w:lang w:val="fr-FR"/>
-        </w:rPr>
-        <w:t xml:space="preserve">Int FormatAndScaleFontData( int NumFont, file </w:t>
+      <w:r>
+        <w:t xml:space="preserve">Int </w:t>
+      </w:r>
+      <w:proofErr w:type="spellStart"/>
+      <w:r>
+        <w:t>FormatAndScaleFontData</w:t>
+      </w:r>
+      <w:proofErr w:type="spellEnd"/>
+      <w:r>
+        <w:t xml:space="preserve">( int </w:t>
+      </w:r>
+      <w:proofErr w:type="spellStart"/>
+      <w:r>
+        <w:t>NumFont</w:t>
+      </w:r>
+      <w:proofErr w:type="spellEnd"/>
+      <w:r>
+        <w:t xml:space="preserve">, file </w:t>
       </w:r>
       <w:r>
         <w:t>*SingleStrokeFont.txt</w:t>
       </w:r>
       <w:r>
-        <w:rPr>
-          <w:lang w:val="fr-FR"/>
-        </w:rPr>
-        <w:t>, int FontSize, int *CharGCode())</w:t>
+        <w:t xml:space="preserve">, int </w:t>
+      </w:r>
+      <w:proofErr w:type="spellStart"/>
+      <w:r>
+        <w:t>FontSize</w:t>
+      </w:r>
+      <w:proofErr w:type="spellEnd"/>
+      <w:r>
+        <w:t>, int *</w:t>
+      </w:r>
+      <w:proofErr w:type="spellStart"/>
+      <w:r>
+        <w:t>CharGCode</w:t>
+      </w:r>
+      <w:proofErr w:type="spellEnd"/>
+      <w:r>
+        <w:t>())</w:t>
       </w:r>
     </w:p>
     <w:p>
@@ -1092,8 +1314,13 @@
       <w:r>
         <w:tab/>
       </w:r>
-      <w:r>
-        <w:t>NumFont – inputs the length o</w:t>
+      <w:proofErr w:type="spellStart"/>
+      <w:r>
+        <w:t>NumFont</w:t>
+      </w:r>
+      <w:proofErr w:type="spellEnd"/>
+      <w:r>
+        <w:t xml:space="preserve"> – inputs the length o</w:t>
       </w:r>
       <w:r>
         <w:t>f the Font.txt used in for loop</w:t>
@@ -1114,16 +1341,42 @@
       <w:pPr>
         <w:ind w:firstLine="720"/>
       </w:pPr>
-      <w:r>
-        <w:t>FontSize – inputs the FontSize determined by the user</w:t>
+      <w:proofErr w:type="spellStart"/>
+      <w:r>
+        <w:t>FontSize</w:t>
+      </w:r>
+      <w:proofErr w:type="spellEnd"/>
+      <w:r>
+        <w:t xml:space="preserve"> – inputs the </w:t>
+      </w:r>
+      <w:proofErr w:type="spellStart"/>
+      <w:r>
+        <w:t>FontSize</w:t>
+      </w:r>
+      <w:proofErr w:type="spellEnd"/>
+      <w:r>
+        <w:t xml:space="preserve"> determined by the user</w:t>
       </w:r>
     </w:p>
     <w:p>
       <w:pPr>
         <w:ind w:firstLine="720"/>
       </w:pPr>
-      <w:r>
-        <w:t>CharGCode() – pointer to the output array which contains the GCode for each character</w:t>
+      <w:proofErr w:type="spellStart"/>
+      <w:r>
+        <w:t>CharGCode</w:t>
+      </w:r>
+      <w:proofErr w:type="spellEnd"/>
+      <w:r>
+        <w:t xml:space="preserve">() – pointer to the output array which contains the </w:t>
+      </w:r>
+      <w:proofErr w:type="spellStart"/>
+      <w:r>
+        <w:t>GCode</w:t>
+      </w:r>
+      <w:proofErr w:type="spellEnd"/>
+      <w:r>
+        <w:t xml:space="preserve"> for each character</w:t>
       </w:r>
     </w:p>
     <w:p>
@@ -1144,7 +1397,15 @@
     </w:p>
     <w:p>
       <w:r>
-        <w:t xml:space="preserve">Int SeperateWords(  </w:t>
+        <w:t xml:space="preserve">Int </w:t>
+      </w:r>
+      <w:proofErr w:type="spellStart"/>
+      <w:r>
+        <w:t>SeperateWords</w:t>
+      </w:r>
+      <w:proofErr w:type="spellEnd"/>
+      <w:r>
+        <w:t xml:space="preserve">(  </w:t>
       </w:r>
       <w:r>
         <w:t>file *</w:t>
@@ -1156,7 +1417,15 @@
         <w:t>.txt</w:t>
       </w:r>
       <w:r>
-        <w:t>, Char *WordContents() )</w:t>
+        <w:t>, Char *</w:t>
+      </w:r>
+      <w:proofErr w:type="spellStart"/>
+      <w:r>
+        <w:t>WordContents</w:t>
+      </w:r>
+      <w:proofErr w:type="spellEnd"/>
+      <w:r>
+        <w:t>() )</w:t>
       </w:r>
     </w:p>
     <w:p>
@@ -1174,8 +1443,13 @@
       <w:pPr>
         <w:ind w:left="720"/>
       </w:pPr>
-      <w:r>
-        <w:t>WordContents() – Pointer to the output array which has separated all characters for each word in array.</w:t>
+      <w:proofErr w:type="spellStart"/>
+      <w:r>
+        <w:t>WordContents</w:t>
+      </w:r>
+      <w:proofErr w:type="spellEnd"/>
+      <w:r>
+        <w:t>() – Pointer to the output array which has separated all characters for each word in array.</w:t>
       </w:r>
     </w:p>
     <w:p>
@@ -1198,20 +1472,49 @@
       <w:r>
         <w:t xml:space="preserve">Int </w:t>
       </w:r>
-      <w:r>
-        <w:t>WordToGCodeandSend(</w:t>
+      <w:proofErr w:type="spellStart"/>
+      <w:r>
+        <w:t>WordToGCodeandSend</w:t>
+      </w:r>
+      <w:proofErr w:type="spellEnd"/>
+      <w:r>
+        <w:t>(</w:t>
       </w:r>
       <w:r>
         <w:t xml:space="preserve"> </w:t>
       </w:r>
       <w:r>
-        <w:t xml:space="preserve">char *WordContents(), </w:t>
-      </w:r>
-      <w:r>
-        <w:t xml:space="preserve">double *CharGCode(), </w:t>
-      </w:r>
-      <w:r>
-        <w:t>int *CharLocation())</w:t>
+        <w:t>char *</w:t>
+      </w:r>
+      <w:proofErr w:type="spellStart"/>
+      <w:r>
+        <w:t>WordContents</w:t>
+      </w:r>
+      <w:proofErr w:type="spellEnd"/>
+      <w:r>
+        <w:t xml:space="preserve">(), </w:t>
+      </w:r>
+      <w:r>
+        <w:t>double *</w:t>
+      </w:r>
+      <w:proofErr w:type="spellStart"/>
+      <w:r>
+        <w:t>CharGCode</w:t>
+      </w:r>
+      <w:proofErr w:type="spellEnd"/>
+      <w:r>
+        <w:t xml:space="preserve">(), </w:t>
+      </w:r>
+      <w:r>
+        <w:t>int *</w:t>
+      </w:r>
+      <w:proofErr w:type="spellStart"/>
+      <w:r>
+        <w:t>CharLocation</w:t>
+      </w:r>
+      <w:proofErr w:type="spellEnd"/>
+      <w:r>
+        <w:t>())</w:t>
       </w:r>
     </w:p>
     <w:p>
@@ -1223,8 +1526,13 @@
       <w:r>
         <w:tab/>
       </w:r>
-      <w:r>
-        <w:t xml:space="preserve">WordContents() </w:t>
+      <w:proofErr w:type="spellStart"/>
+      <w:r>
+        <w:t>WordContents</w:t>
+      </w:r>
+      <w:proofErr w:type="spellEnd"/>
+      <w:r>
+        <w:t xml:space="preserve">() </w:t>
       </w:r>
       <w:r>
         <w:t>–</w:t>
@@ -1239,7 +1547,22 @@
     <w:p>
       <w:r>
         <w:tab/>
-        <w:t>CharGCode() – inputs the array containing the GCode for each character</w:t>
+      </w:r>
+      <w:proofErr w:type="spellStart"/>
+      <w:r>
+        <w:t>CharGCode</w:t>
+      </w:r>
+      <w:proofErr w:type="spellEnd"/>
+      <w:r>
+        <w:t xml:space="preserve">() – inputs the array containing the </w:t>
+      </w:r>
+      <w:proofErr w:type="spellStart"/>
+      <w:r>
+        <w:t>GCode</w:t>
+      </w:r>
+      <w:proofErr w:type="spellEnd"/>
+      <w:r>
+        <w:t xml:space="preserve"> for each character</w:t>
       </w:r>
     </w:p>
     <w:p>
@@ -1250,15 +1573,36 @@
           <w:szCs w:val="18"/>
         </w:rPr>
       </w:pPr>
-      <w:r>
-        <w:t xml:space="preserve">CharLocation() – </w:t>
+      <w:proofErr w:type="spellStart"/>
+      <w:r>
+        <w:t>CharLocation</w:t>
+      </w:r>
+      <w:proofErr w:type="spellEnd"/>
+      <w:r>
+        <w:t xml:space="preserve">() – </w:t>
       </w:r>
       <w:r>
         <w:rPr>
           <w:sz w:val="20"/>
           <w:szCs w:val="18"/>
         </w:rPr>
-        <w:t>inputs the array containing the location of each character within  CharGCode()</w:t>
+        <w:t xml:space="preserve">inputs the array containing the location of each character within  </w:t>
+      </w:r>
+      <w:proofErr w:type="spellStart"/>
+      <w:r>
+        <w:rPr>
+          <w:sz w:val="20"/>
+          <w:szCs w:val="18"/>
+        </w:rPr>
+        <w:t>CharGCode</w:t>
+      </w:r>
+      <w:proofErr w:type="spellEnd"/>
+      <w:r>
+        <w:rPr>
+          <w:sz w:val="20"/>
+          <w:szCs w:val="18"/>
+        </w:rPr>
+        <w:t>()</w:t>
       </w:r>
     </w:p>
     <w:p>
@@ -1274,18 +1618,52 @@
     </w:p>
     <w:p>
       <w:r>
-        <w:t xml:space="preserve">Int SendToRobot( </w:t>
-      </w:r>
-      <w:r>
-        <w:t>Double CurrentWordGCode())</w:t>
+        <w:t xml:space="preserve">Int </w:t>
+      </w:r>
+      <w:proofErr w:type="spellStart"/>
+      <w:r>
+        <w:t>SendToRobot</w:t>
+      </w:r>
+      <w:proofErr w:type="spellEnd"/>
+      <w:r>
+        <w:t xml:space="preserve">( </w:t>
+      </w:r>
+      <w:r>
+        <w:t xml:space="preserve">Double </w:t>
+      </w:r>
+      <w:proofErr w:type="spellStart"/>
+      <w:r>
+        <w:t>Current</w:t>
+      </w:r>
+      <w:r>
+        <w:t>Character</w:t>
+      </w:r>
+      <w:r>
+        <w:t>GCode</w:t>
+      </w:r>
+      <w:proofErr w:type="spellEnd"/>
+      <w:r>
+        <w:t>())</w:t>
       </w:r>
     </w:p>
     <w:p>
       <w:pPr>
         <w:ind w:left="720"/>
       </w:pPr>
-      <w:r>
-        <w:t xml:space="preserve">CurrentWordGCode() – inputs the current chunk of instructions to be converted to serial </w:t>
+      <w:proofErr w:type="spellStart"/>
+      <w:r>
+        <w:lastRenderedPageBreak/>
+        <w:t>Current</w:t>
+      </w:r>
+      <w:r>
+        <w:t>Character</w:t>
+      </w:r>
+      <w:r>
+        <w:t>GCode</w:t>
+      </w:r>
+      <w:proofErr w:type="spellEnd"/>
+      <w:r>
+        <w:t xml:space="preserve">() – inputs the current chunk of instructions to be converted to serial </w:t>
       </w:r>
       <w:r>
         <w:t>and sent to robot</w:t>
@@ -1296,7 +1674,6 @@
         <w:ind w:left="720"/>
       </w:pPr>
       <w:r>
-        <w:lastRenderedPageBreak/>
         <w:t>Return value – returns 1 is successful, 0 if failed</w:t>
       </w:r>
     </w:p>
@@ -1312,7 +1689,7 @@
     <w:tbl>
       <w:tblPr>
         <w:tblStyle w:val="TableGrid"/>
-        <w:tblW w:w="0" w:type="auto"/>
+        <w:tblW w:w="9493" w:type="dxa"/>
         <w:tblLayout w:type="fixed"/>
         <w:tblLook w:val="04A0" w:firstRow="1" w:lastRow="0" w:firstColumn="1" w:lastColumn="0" w:noHBand="0" w:noVBand="1"/>
       </w:tblPr>
@@ -1320,7 +1697,7 @@
         <w:gridCol w:w="2547"/>
         <w:gridCol w:w="1701"/>
         <w:gridCol w:w="2292"/>
-        <w:gridCol w:w="2476"/>
+        <w:gridCol w:w="2953"/>
       </w:tblGrid>
       <w:tr>
         <w:tc>
@@ -1364,7 +1741,7 @@
         </w:tc>
         <w:tc>
           <w:tcPr>
-            <w:tcW w:w="2476" w:type="dxa"/>
+            <w:tcW w:w="2953" w:type="dxa"/>
           </w:tcPr>
           <w:p>
             <w:pPr>
@@ -1470,7 +1847,7 @@
         </w:tc>
         <w:tc>
           <w:tcPr>
-            <w:tcW w:w="2476" w:type="dxa"/>
+            <w:tcW w:w="2953" w:type="dxa"/>
           </w:tcPr>
           <w:p>
             <w:r>
@@ -1517,12 +1894,14 @@
             <w:tcW w:w="2547" w:type="dxa"/>
           </w:tcPr>
           <w:p>
+            <w:proofErr w:type="spellStart"/>
             <w:r>
               <w:rPr>
                 <w:lang w:val="fr-FR"/>
               </w:rPr>
               <w:t>GetCharLocation</w:t>
             </w:r>
+            <w:proofErr w:type="spellEnd"/>
             <w:r>
               <w:rPr>
                 <w:lang w:val="fr-FR"/>
@@ -1553,14 +1932,22 @@
         </w:tc>
         <w:tc>
           <w:tcPr>
-            <w:tcW w:w="2476" w:type="dxa"/>
+            <w:tcW w:w="2953" w:type="dxa"/>
           </w:tcPr>
           <w:p>
             <w:r>
               <w:t xml:space="preserve">Every time 999 is read from </w:t>
             </w:r>
             <w:r>
-              <w:t>font data the line location is written in a new column in CharLocation()</w:t>
+              <w:t xml:space="preserve">font data the line location is written in a new column in </w:t>
+            </w:r>
+            <w:proofErr w:type="spellStart"/>
+            <w:r>
+              <w:t>CharLocation</w:t>
+            </w:r>
+            <w:proofErr w:type="spellEnd"/>
+            <w:r>
+              <w:t>()</w:t>
             </w:r>
           </w:p>
         </w:tc>
@@ -1574,12 +1961,14 @@
             <w:tcW w:w="2547" w:type="dxa"/>
           </w:tcPr>
           <w:p>
+            <w:proofErr w:type="spellStart"/>
             <w:r>
               <w:rPr>
                 <w:lang w:val="fr-FR"/>
               </w:rPr>
               <w:t>FormatAndScaleFontData</w:t>
             </w:r>
+            <w:proofErr w:type="spellEnd"/>
             <w:r>
               <w:rPr>
                 <w:lang w:val="fr-FR"/>
@@ -1614,11 +2003,27 @@
         </w:tc>
         <w:tc>
           <w:tcPr>
-            <w:tcW w:w="2476" w:type="dxa"/>
-          </w:tcPr>
-          <w:p>
-            <w:r>
-              <w:t>The scaled Gcode data is stored in the array CharGCode()</w:t>
+            <w:tcW w:w="2953" w:type="dxa"/>
+          </w:tcPr>
+          <w:p>
+            <w:r>
+              <w:t xml:space="preserve">The scaled </w:t>
+            </w:r>
+            <w:proofErr w:type="spellStart"/>
+            <w:r>
+              <w:t>Gcode</w:t>
+            </w:r>
+            <w:proofErr w:type="spellEnd"/>
+            <w:r>
+              <w:t xml:space="preserve"> data is stored in the array </w:t>
+            </w:r>
+            <w:proofErr w:type="spellStart"/>
+            <w:r>
+              <w:t>CharGCode</w:t>
+            </w:r>
+            <w:proofErr w:type="spellEnd"/>
+            <w:r>
+              <w:t>()</w:t>
             </w:r>
           </w:p>
         </w:tc>
@@ -1632,8 +2037,13 @@
             <w:tcW w:w="2547" w:type="dxa"/>
           </w:tcPr>
           <w:p>
-            <w:r>
-              <w:t>SeperateWords()</w:t>
+            <w:proofErr w:type="spellStart"/>
+            <w:r>
+              <w:t>SeperateWords</w:t>
+            </w:r>
+            <w:proofErr w:type="spellEnd"/>
+            <w:r>
+              <w:t>()</w:t>
             </w:r>
           </w:p>
         </w:tc>
@@ -1665,11 +2075,19 @@
         </w:tc>
         <w:tc>
           <w:tcPr>
-            <w:tcW w:w="2476" w:type="dxa"/>
-          </w:tcPr>
-          <w:p>
-            <w:r>
-              <w:t>The WordContents() array contains all the characters in test.txt with letters in the same word separated along columns and different words separated along rows</w:t>
+            <w:tcW w:w="2953" w:type="dxa"/>
+          </w:tcPr>
+          <w:p>
+            <w:r>
+              <w:t xml:space="preserve">The </w:t>
+            </w:r>
+            <w:proofErr w:type="spellStart"/>
+            <w:r>
+              <w:t>WordContents</w:t>
+            </w:r>
+            <w:proofErr w:type="spellEnd"/>
+            <w:r>
+              <w:t>() array contains all the characters in test.txt with letters in the same word separated along columns and different words separated along rows</w:t>
             </w:r>
           </w:p>
         </w:tc>
@@ -1683,8 +2101,13 @@
             <w:tcW w:w="2547" w:type="dxa"/>
           </w:tcPr>
           <w:p>
-            <w:r>
-              <w:t>WordToGCodeandSend()</w:t>
+            <w:proofErr w:type="spellStart"/>
+            <w:r>
+              <w:t>WordToGCodeandSend</w:t>
+            </w:r>
+            <w:proofErr w:type="spellEnd"/>
+            <w:r>
+              <w:t>()</w:t>
             </w:r>
           </w:p>
         </w:tc>
@@ -1708,14 +2131,19 @@
             <w:tcW w:w="2292" w:type="dxa"/>
           </w:tcPr>
           <w:p>
-            <w:r>
-              <w:t>WordContents()</w:t>
-            </w:r>
-          </w:p>
-        </w:tc>
-        <w:tc>
-          <w:tcPr>
-            <w:tcW w:w="2476" w:type="dxa"/>
+            <w:proofErr w:type="spellStart"/>
+            <w:r>
+              <w:t>WordContents</w:t>
+            </w:r>
+            <w:proofErr w:type="spellEnd"/>
+            <w:r>
+              <w:t>()</w:t>
+            </w:r>
+          </w:p>
+        </w:tc>
+        <w:tc>
+          <w:tcPr>
+            <w:tcW w:w="2953" w:type="dxa"/>
           </w:tcPr>
           <w:p>
             <w:r>
@@ -1733,7 +2161,7 @@
               <w:t>as it cannot fi</w:t>
             </w:r>
             <w:r>
-              <w:t>y</w:t>
+              <w:t>t</w:t>
             </w:r>
             <w:r>
               <w:t xml:space="preserve"> onto the page</w:t>
@@ -1750,8 +2178,13 @@
             <w:tcW w:w="2547" w:type="dxa"/>
           </w:tcPr>
           <w:p>
-            <w:r>
-              <w:t>SendToRobot()</w:t>
+            <w:proofErr w:type="spellStart"/>
+            <w:r>
+              <w:t>SendToRobot</w:t>
+            </w:r>
+            <w:proofErr w:type="spellEnd"/>
+            <w:r>
+              <w:t>()</w:t>
             </w:r>
           </w:p>
         </w:tc>
@@ -1761,12 +2194,28 @@
           </w:tcPr>
           <w:p>
             <w:r>
-              <w:t xml:space="preserve">1. Correct GCode </w:t>
-            </w:r>
-          </w:p>
-          <w:p>
-            <w:r>
-              <w:t>2. CorruptedGcode (wrong format)</w:t>
+              <w:t xml:space="preserve">1. Correct </w:t>
+            </w:r>
+            <w:proofErr w:type="spellStart"/>
+            <w:r>
+              <w:t>GCode</w:t>
+            </w:r>
+            <w:proofErr w:type="spellEnd"/>
+            <w:r>
+              <w:t xml:space="preserve"> </w:t>
+            </w:r>
+          </w:p>
+          <w:p>
+            <w:r>
+              <w:t xml:space="preserve">2. </w:t>
+            </w:r>
+            <w:proofErr w:type="spellStart"/>
+            <w:r>
+              <w:t>CorruptedGcode</w:t>
+            </w:r>
+            <w:proofErr w:type="spellEnd"/>
+            <w:r>
+              <w:t xml:space="preserve"> (wrong format)</w:t>
             </w:r>
           </w:p>
         </w:tc>
@@ -1775,8 +2224,25 @@
             <w:tcW w:w="2292" w:type="dxa"/>
           </w:tcPr>
           <w:p>
-            <w:r>
-              <w:t>CurentWordGCode()</w:t>
+            <w:proofErr w:type="spellStart"/>
+            <w:r>
+              <w:t>Cur</w:t>
+            </w:r>
+            <w:r>
+              <w:t>r</w:t>
+            </w:r>
+            <w:r>
+              <w:t>ent</w:t>
+            </w:r>
+            <w:r>
+              <w:t>Character</w:t>
+            </w:r>
+            <w:r>
+              <w:t>GCode</w:t>
+            </w:r>
+            <w:proofErr w:type="spellEnd"/>
+            <w:r>
+              <w:t>()</w:t>
             </w:r>
           </w:p>
           <w:p>
@@ -1801,17 +2267,53 @@
               <w:t>case 2</w:t>
             </w:r>
             <w:r>
-              <w:t xml:space="preserve"> change a pen position number to non Boolean (7))</w:t>
-            </w:r>
-          </w:p>
-        </w:tc>
-        <w:tc>
-          <w:tcPr>
-            <w:tcW w:w="2476" w:type="dxa"/>
-          </w:tcPr>
-          <w:p>
-            <w:r>
-              <w:t>1. Robot receives all data and “writes” the GCode in CurentWordGCode()</w:t>
+              <w:t xml:space="preserve"> change a pen position number to </w:t>
+            </w:r>
+            <w:proofErr w:type="spellStart"/>
+            <w:r>
+              <w:t>non Boolean</w:t>
+            </w:r>
+            <w:proofErr w:type="spellEnd"/>
+            <w:r>
+              <w:t xml:space="preserve"> (7))</w:t>
+            </w:r>
+          </w:p>
+        </w:tc>
+        <w:tc>
+          <w:tcPr>
+            <w:tcW w:w="2953" w:type="dxa"/>
+          </w:tcPr>
+          <w:p>
+            <w:r>
+              <w:t xml:space="preserve">1. Robot receives all data and “writes” the </w:t>
+            </w:r>
+            <w:proofErr w:type="spellStart"/>
+            <w:r>
+              <w:t>GCode</w:t>
+            </w:r>
+            <w:proofErr w:type="spellEnd"/>
+            <w:r>
+              <w:t xml:space="preserve"> in </w:t>
+            </w:r>
+            <w:proofErr w:type="spellStart"/>
+            <w:r>
+              <w:t>Cu</w:t>
+            </w:r>
+            <w:r>
+              <w:t>r</w:t>
+            </w:r>
+            <w:r>
+              <w:t>rent</w:t>
+            </w:r>
+            <w:r>
+              <w:t>Character</w:t>
+            </w:r>
+            <w:r>
+              <w:t>GCode</w:t>
+            </w:r>
+            <w:proofErr w:type="spellEnd"/>
+            <w:r>
+              <w:t>()</w:t>
             </w:r>
           </w:p>
           <w:p>
@@ -1869,14 +2371,66 @@
     <w:p>
       <w:pPr>
         <w:pStyle w:val="Heading1"/>
-      </w:pPr>
-      <w:r>
+        <w:rPr>
+          <w:lang w:val="it-IT"/>
+        </w:rPr>
+      </w:pPr>
+      <w:r>
+        <w:rPr>
+          <w:lang w:val="it-IT"/>
+        </w:rPr>
         <w:lastRenderedPageBreak/>
         <w:t>AI Statement</w:t>
       </w:r>
     </w:p>
-    <w:p/>
-    <w:p/>
+    <w:p>
+      <w:pPr>
+        <w:rPr>
+          <w:lang w:val="it-IT"/>
+        </w:rPr>
+      </w:pPr>
+      <w:r>
+        <w:rPr>
+          <w:lang w:val="it-IT"/>
+        </w:rPr>
+        <w:t xml:space="preserve">No AI </w:t>
+      </w:r>
+      <w:proofErr w:type="spellStart"/>
+      <w:r>
+        <w:rPr>
+          <w:lang w:val="it-IT"/>
+        </w:rPr>
+        <w:t>w</w:t>
+      </w:r>
+      <w:r>
+        <w:rPr>
+          <w:lang w:val="it-IT"/>
+        </w:rPr>
+        <w:t>as</w:t>
+      </w:r>
+      <w:proofErr w:type="spellEnd"/>
+      <w:r>
+        <w:rPr>
+          <w:lang w:val="it-IT"/>
+        </w:rPr>
+        <w:t xml:space="preserve"> </w:t>
+      </w:r>
+      <w:proofErr w:type="spellStart"/>
+      <w:r>
+        <w:rPr>
+          <w:lang w:val="it-IT"/>
+        </w:rPr>
+        <w:t>used</w:t>
+      </w:r>
+      <w:proofErr w:type="spellEnd"/>
+    </w:p>
+    <w:p>
+      <w:pPr>
+        <w:rPr>
+          <w:lang w:val="it-IT"/>
+        </w:rPr>
+      </w:pPr>
+    </w:p>
     <w:sectPr>
       <w:pgSz w:w="11906" w:h="16838"/>
       <w:pgMar w:top="709" w:right="1440" w:bottom="1440" w:left="1440" w:header="708" w:footer="708" w:gutter="0"/>

</xml_diff>

<commit_message>
Set Up changes for Newest Coursework
</commit_message>
<xml_diff>
--- a/ProjectPlanning egyeb12.docx
+++ b/ProjectPlanning egyeb12.docx
@@ -33,115 +33,213 @@
     </w:p>
     <w:p>
       <w:r>
-        <w:t>The Code initially opens and reads a txt file containing the font data and gets a user input for the font size. Using the font G code data and size the positions and code for each character in the txt file is translated to the correct format and scaled, before being stored in an array (</w:t>
+        <w:t>Problems to be solved ( in order):</w:t>
+      </w:r>
+    </w:p>
+    <w:p>
+      <w:pPr>
+        <w:pStyle w:val="ListParagraph"/>
+        <w:numPr>
+          <w:ilvl w:val="0"/>
+          <w:numId w:val="3"/>
+        </w:numPr>
+      </w:pPr>
+      <w:r>
+        <w:t xml:space="preserve">Open and read a txt file containing font data </w:t>
+      </w:r>
+    </w:p>
+    <w:p>
+      <w:pPr>
+        <w:pStyle w:val="ListParagraph"/>
+        <w:numPr>
+          <w:ilvl w:val="0"/>
+          <w:numId w:val="3"/>
+        </w:numPr>
+      </w:pPr>
+      <w:r>
+        <w:t xml:space="preserve">Get a user input for the font size between 4 and 10 </w:t>
+      </w:r>
+    </w:p>
+    <w:p>
+      <w:pPr>
+        <w:pStyle w:val="ListParagraph"/>
+        <w:numPr>
+          <w:ilvl w:val="0"/>
+          <w:numId w:val="3"/>
+        </w:numPr>
+      </w:pPr>
+      <w:r>
+        <w:t xml:space="preserve">Scale the </w:t>
       </w:r>
       <w:proofErr w:type="spellStart"/>
       <w:r>
+        <w:t>GCode</w:t>
+      </w:r>
+      <w:proofErr w:type="spellEnd"/>
+      <w:r>
+        <w:t xml:space="preserve"> data that will be sent to the robot with the font size (user inputted value</w:t>
+      </w:r>
+      <w:r>
+        <w:t>/10)</w:t>
+      </w:r>
+    </w:p>
+    <w:p>
+      <w:pPr>
+        <w:pStyle w:val="ListParagraph"/>
+        <w:numPr>
+          <w:ilvl w:val="0"/>
+          <w:numId w:val="3"/>
+        </w:numPr>
+      </w:pPr>
+      <w:r>
+        <w:t xml:space="preserve">Store the </w:t>
+      </w:r>
+      <w:proofErr w:type="spellStart"/>
+      <w:r>
+        <w:t>GCode</w:t>
+      </w:r>
+      <w:proofErr w:type="spellEnd"/>
+      <w:r>
+        <w:t xml:space="preserve"> data locally so it is all in memory, with </w:t>
+      </w:r>
+      <w:r>
+        <w:t>each letter being able to be accessed separately using a pointer to the position.</w:t>
+      </w:r>
+    </w:p>
+    <w:p>
+      <w:pPr>
+        <w:pStyle w:val="ListParagraph"/>
+        <w:numPr>
+          <w:ilvl w:val="0"/>
+          <w:numId w:val="3"/>
+        </w:numPr>
+      </w:pPr>
+      <w:r>
+        <w:t xml:space="preserve">Open a txt file containing the words to be written </w:t>
+      </w:r>
+    </w:p>
+    <w:p>
+      <w:pPr>
+        <w:pStyle w:val="ListParagraph"/>
+        <w:numPr>
+          <w:ilvl w:val="0"/>
+          <w:numId w:val="3"/>
+        </w:numPr>
+      </w:pPr>
+      <w:r>
+        <w:t xml:space="preserve">Separate the words to be written and </w:t>
+      </w:r>
+      <w:r>
+        <w:t xml:space="preserve">store the first word to be written </w:t>
+      </w:r>
+    </w:p>
+    <w:p>
+      <w:pPr>
+        <w:pStyle w:val="ListParagraph"/>
+        <w:numPr>
+          <w:ilvl w:val="0"/>
+          <w:numId w:val="3"/>
+        </w:numPr>
+      </w:pPr>
+      <w:r>
+        <w:t xml:space="preserve">Set the initial conditions for the robot </w:t>
+      </w:r>
+      <w:r>
+        <w:t xml:space="preserve">(x=0 y=0 and </w:t>
+      </w:r>
+      <w:r>
+        <w:t xml:space="preserve">pen up) and send them to the robot </w:t>
+      </w:r>
+    </w:p>
+    <w:p>
+      <w:pPr>
+        <w:pStyle w:val="ListParagraph"/>
+        <w:numPr>
+          <w:ilvl w:val="0"/>
+          <w:numId w:val="3"/>
+        </w:numPr>
+      </w:pPr>
+      <w:r>
+        <w:t xml:space="preserve">For each word, </w:t>
+      </w:r>
+      <w:r>
+        <w:t xml:space="preserve">The x and y starting positions determined (if the word length + current words in line are greater than the maximum x space on page a new line is made and the word starts on the new line (change in y)) (x position is then determined as if </w:t>
+      </w:r>
+      <w:proofErr w:type="spellStart"/>
+      <w:r>
+        <w:t>its</w:t>
+      </w:r>
+      <w:proofErr w:type="spellEnd"/>
+      <w:r>
+        <w:t xml:space="preserve"> on a new line it is 0 and if its carrying on from the last word it is the ending x point of the last word plus a gap)</w:t>
+      </w:r>
+    </w:p>
+    <w:p>
+      <w:pPr>
+        <w:pStyle w:val="ListParagraph"/>
+        <w:ind w:firstLine="720"/>
+      </w:pPr>
+      <w:r>
+        <w:t>For each letter</w:t>
+      </w:r>
+      <w:r>
+        <w:t>:</w:t>
+      </w:r>
+    </w:p>
+    <w:p>
+      <w:pPr>
+        <w:ind w:left="2160"/>
+      </w:pPr>
+      <w:r>
+        <w:t xml:space="preserve">a. The character is read and the location of the G code in </w:t>
+      </w:r>
+      <w:proofErr w:type="spellStart"/>
+      <w:r>
         <w:t>WordGCode</w:t>
       </w:r>
       <w:proofErr w:type="spellEnd"/>
       <w:r>
-        <w:t>()). Each letter can be accessed from x position in the array, where x is the starting location for each character which is determined by a for loop and the positions are stored in a different array (</w:t>
+        <w:t>() is found</w:t>
+      </w:r>
+    </w:p>
+    <w:p>
+      <w:pPr>
+        <w:pStyle w:val="ListParagraph"/>
+        <w:ind w:left="2160"/>
+      </w:pPr>
+      <w:r>
+        <w:t xml:space="preserve">b. From the x and y starting point the </w:t>
       </w:r>
       <w:proofErr w:type="spellStart"/>
       <w:r>
-        <w:t>CharLocation</w:t>
+        <w:t>Gcode</w:t>
       </w:r>
       <w:proofErr w:type="spellEnd"/>
       <w:r>
-        <w:t>()).</w:t>
-      </w:r>
-    </w:p>
-    <w:p>
-      <w:r>
-        <w:t>The txt file containing the text to be "written" is then opened, and each word is separated and stored in separate columns of an array  (</w:t>
+        <w:t xml:space="preserve"> is loaded in from the file and the x and y starting positions are added to all lines of the code for that character.</w:t>
+      </w:r>
+    </w:p>
+    <w:p>
+      <w:pPr>
+        <w:pStyle w:val="ListParagraph"/>
+        <w:ind w:left="2160"/>
+      </w:pPr>
+      <w:r>
+        <w:t xml:space="preserve">c. The data is formatted into the exact G code style needed and stored in        </w:t>
       </w:r>
       <w:proofErr w:type="spellStart"/>
       <w:r>
-        <w:t>WordContents</w:t>
+        <w:t>CurrentCharacterGCode</w:t>
       </w:r>
       <w:proofErr w:type="spellEnd"/>
       <w:r>
-        <w:t>()). The initial conditions for the robot are then generated and sent (spindle on, pen up and position at 0,0).</w:t>
-      </w:r>
-    </w:p>
-    <w:p>
-      <w:r>
-        <w:t xml:space="preserve">For each word, </w:t>
-      </w:r>
-    </w:p>
-    <w:p>
-      <w:pPr>
-        <w:ind w:left="720"/>
-      </w:pPr>
-      <w:r>
-        <w:t xml:space="preserve">1. The x and y starting positions determined (if the word length + current words in line are greater than the maximum x space on page a new line is made and the word starts on the new line (change in y)) (x position is then determined as if </w:t>
-      </w:r>
-      <w:proofErr w:type="spellStart"/>
-      <w:r>
-        <w:t>its</w:t>
-      </w:r>
-      <w:proofErr w:type="spellEnd"/>
-      <w:r>
-        <w:t xml:space="preserve"> on a new line it is 0 and if its carrying on from the last word it is the ending x point of the last word plus a gap)</w:t>
-      </w:r>
-    </w:p>
-    <w:p>
-      <w:r>
-        <w:tab/>
-        <w:t>2. For each letter</w:t>
-      </w:r>
-    </w:p>
-    <w:p>
-      <w:r>
-        <w:tab/>
-      </w:r>
-      <w:r>
-        <w:tab/>
-        <w:t xml:space="preserve">a. The character is read and the location of the G code in </w:t>
-      </w:r>
-      <w:proofErr w:type="spellStart"/>
-      <w:r>
-        <w:t>WordGCode</w:t>
-      </w:r>
-      <w:proofErr w:type="spellEnd"/>
-      <w:r>
-        <w:t>() is found</w:t>
-      </w:r>
-    </w:p>
-    <w:p>
-      <w:pPr>
-        <w:ind w:left="1440"/>
-      </w:pPr>
-      <w:r>
-        <w:t xml:space="preserve">b. From the x and y starting point the </w:t>
-      </w:r>
-      <w:proofErr w:type="spellStart"/>
-      <w:r>
-        <w:t>Gcode</w:t>
-      </w:r>
-      <w:proofErr w:type="spellEnd"/>
-      <w:r>
-        <w:t xml:space="preserve"> is loaded in from the file and the x and y starting positions are added to all lines of the code for that character.</w:t>
-      </w:r>
-    </w:p>
-    <w:p>
-      <w:pPr>
-        <w:ind w:left="1440"/>
-      </w:pPr>
-      <w:r>
-        <w:t xml:space="preserve">c. The data is formatted into the exact G code style needed and stored in        </w:t>
-      </w:r>
-      <w:proofErr w:type="spellStart"/>
-      <w:r>
-        <w:t>CurrentWordGCode</w:t>
-      </w:r>
-      <w:proofErr w:type="spellEnd"/>
-      <w:r>
         <w:t>()</w:t>
       </w:r>
     </w:p>
     <w:p>
+      <w:pPr>
+        <w:pStyle w:val="ListParagraph"/>
+      </w:pPr>
       <w:r>
         <w:tab/>
       </w:r>
@@ -152,36 +250,77 @@
     </w:p>
     <w:p>
       <w:pPr>
-        <w:ind w:left="720"/>
-      </w:pPr>
-      <w:r>
-        <w:t>3. For all but the first word, the code waits until /n is sent from the robot to request a new words data.</w:t>
-      </w:r>
-    </w:p>
-    <w:p>
-      <w:pPr>
-        <w:ind w:left="720"/>
-      </w:pPr>
-      <w:r>
-        <w:t xml:space="preserve">4. The </w:t>
+        <w:pStyle w:val="ListParagraph"/>
+        <w:ind w:left="2160"/>
+      </w:pPr>
+      <w:r>
+        <w:t>e.  For all but the first character, the code waits until /n is sent from the robot to request a new words data.</w:t>
+      </w:r>
+    </w:p>
+    <w:p>
+      <w:pPr>
+        <w:pStyle w:val="ListParagraph"/>
+        <w:ind w:left="2160"/>
+      </w:pPr>
+      <w:r>
+        <w:t xml:space="preserve">f. The </w:t>
       </w:r>
       <w:proofErr w:type="spellStart"/>
       <w:r>
-        <w:t>CurrentWordGCode</w:t>
+        <w:t>CurrentCharacterGCode</w:t>
       </w:r>
       <w:proofErr w:type="spellEnd"/>
       <w:r>
-        <w:t>() data is processed into the correct data channels and sent to the robot.</w:t>
-      </w:r>
-    </w:p>
-    <w:p>
+        <w:t xml:space="preserve">() data is processed into </w:t>
+      </w:r>
+      <w:r>
+        <w:t>serial and</w:t>
+      </w:r>
+      <w:r>
+        <w:t xml:space="preserve"> sent to the robot.</w:t>
+      </w:r>
+    </w:p>
+    <w:p>
+      <w:pPr>
+        <w:ind w:left="1440"/>
+      </w:pPr>
+      <w:r>
+        <w:t xml:space="preserve">After all letters in the word are complete, </w:t>
+      </w:r>
+      <w:r>
+        <w:t xml:space="preserve">The next Word is then read from the txt file and saved in separate columns of an array  </w:t>
+      </w:r>
+      <w:proofErr w:type="spellStart"/>
+      <w:r>
+        <w:t>WordContents</w:t>
+      </w:r>
+      <w:proofErr w:type="spellEnd"/>
+      <w:r>
+        <w:t>().</w:t>
+      </w:r>
+    </w:p>
+    <w:p>
+      <w:pPr>
+        <w:pStyle w:val="ListParagraph"/>
+        <w:numPr>
+          <w:ilvl w:val="0"/>
+          <w:numId w:val="3"/>
+        </w:numPr>
+      </w:pPr>
       <w:r>
         <w:t>After all words are complete and the text file has reached the end, the pen is set to the up position and is sent to 0,0. Then turn off the robot.</w:t>
       </w:r>
     </w:p>
     <w:p>
-      <w:r>
-        <w:t>Then end the program.</w:t>
+      <w:pPr>
+        <w:pStyle w:val="ListParagraph"/>
+        <w:numPr>
+          <w:ilvl w:val="0"/>
+          <w:numId w:val="3"/>
+        </w:numPr>
+      </w:pPr>
+      <w:r>
+        <w:t>Terminate the program</w:t>
       </w:r>
     </w:p>
     <w:p>
@@ -193,6 +332,9 @@
           <w:szCs w:val="32"/>
         </w:rPr>
       </w:pPr>
+      <w:r>
+        <w:t>There must also be error checking throughout for incorrect user inputs, words that are too long to type and if the txt documents aren’t in the correct format or don’t exist.</w:t>
+      </w:r>
       <w:r>
         <w:br w:type="page"/>
       </w:r>
@@ -214,8 +356,8 @@
       </w:tblPr>
       <w:tblGrid>
         <w:gridCol w:w="2505"/>
-        <w:gridCol w:w="1767"/>
-        <w:gridCol w:w="4744"/>
+        <w:gridCol w:w="1764"/>
+        <w:gridCol w:w="4747"/>
       </w:tblGrid>
       <w:tr>
         <w:tc>
@@ -310,10 +452,30 @@
           </w:tcPr>
           <w:p>
             <w:r>
-              <w:t xml:space="preserve">Breaks down the words in the text to individual characters, then stores each word on a separate column </w:t>
-            </w:r>
-            <w:r>
-              <w:t>so the code has easy access to which character it needs to process.</w:t>
+              <w:t xml:space="preserve">Breaks down the words in the text to individual characters, then stores each </w:t>
+            </w:r>
+            <w:r>
+              <w:t>character</w:t>
+            </w:r>
+            <w:r>
+              <w:t xml:space="preserve"> on a separate column </w:t>
+            </w:r>
+            <w:r>
+              <w:t>so the code has easy access to which character it needs to process</w:t>
+            </w:r>
+            <w:r>
+              <w:t xml:space="preserve"> </w:t>
+            </w:r>
+            <w:r>
+              <w:t xml:space="preserve">using the x position of the array for the </w:t>
+            </w:r>
+            <w:proofErr w:type="spellStart"/>
+            <w:r>
+              <w:t>xth</w:t>
+            </w:r>
+            <w:proofErr w:type="spellEnd"/>
+            <w:r>
+              <w:t xml:space="preserve"> word. </w:t>
             </w:r>
           </w:p>
         </w:tc>
@@ -371,7 +533,7 @@
               <w:t>, with the X,Y and P positions in separate columns</w:t>
             </w:r>
             <w:r>
-              <w:t>.</w:t>
+              <w:t>. The Separate columns are in place to allow for easy grabbing of x y positions when adding values to offset them from the last character or word.</w:t>
             </w:r>
           </w:p>
         </w:tc>
@@ -427,6 +589,47 @@
             <w:r>
               <w:t>() array for easy lookup for every character</w:t>
             </w:r>
+            <w:r>
+              <w:t xml:space="preserve">. As </w:t>
+            </w:r>
+            <w:proofErr w:type="spellStart"/>
+            <w:r>
+              <w:t>CharGCode</w:t>
+            </w:r>
+            <w:proofErr w:type="spellEnd"/>
+            <w:r>
+              <w:t xml:space="preserve">() has every </w:t>
+            </w:r>
+            <w:r>
+              <w:t xml:space="preserve">character in it the </w:t>
+            </w:r>
+            <w:proofErr w:type="spellStart"/>
+            <w:r>
+              <w:t>CharLocation</w:t>
+            </w:r>
+            <w:proofErr w:type="spellEnd"/>
+            <w:r>
+              <w:t xml:space="preserve">() array acts as a pointer to the location of each letter in </w:t>
+            </w:r>
+            <w:proofErr w:type="spellStart"/>
+            <w:r>
+              <w:t>CharGCode</w:t>
+            </w:r>
+            <w:proofErr w:type="spellEnd"/>
+            <w:r>
+              <w:t xml:space="preserve">() </w:t>
+            </w:r>
+            <w:r>
+              <w:t xml:space="preserve">so you do not have to search though the entire </w:t>
+            </w:r>
+            <w:proofErr w:type="spellStart"/>
+            <w:r>
+              <w:t>CharGCode</w:t>
+            </w:r>
+            <w:proofErr w:type="spellEnd"/>
+            <w:r>
+              <w:t xml:space="preserve">() for every character printed. </w:t>
+            </w:r>
           </w:p>
         </w:tc>
       </w:tr>
@@ -488,7 +691,16 @@
               <w:t>the character</w:t>
             </w:r>
             <w:r>
-              <w:t xml:space="preserve"> that is being sent to the robot which will later be converted to serial and sent </w:t>
+              <w:t xml:space="preserve"> that is being sent to the robot which will later be converted to serial and sent</w:t>
+            </w:r>
+            <w:r>
+              <w:t xml:space="preserve">. Stored in an array with 3 columns (1 for </w:t>
+            </w:r>
+            <w:r>
+              <w:t xml:space="preserve">x 1 for y 1 for pen) as the string to be sent requires 3 inputs </w:t>
+            </w:r>
+            <w:r>
+              <w:t xml:space="preserve">to be sent in the right format. </w:t>
             </w:r>
           </w:p>
         </w:tc>
@@ -671,6 +883,12 @@
             <w:r>
               <w:t>from the end of the last word</w:t>
             </w:r>
+            <w:r>
+              <w:t xml:space="preserve"> so words can be disti</w:t>
+            </w:r>
+            <w:r>
+              <w:t>nguished</w:t>
+            </w:r>
           </w:p>
         </w:tc>
       </w:tr>
@@ -711,6 +929,9 @@
             <w:r>
               <w:t>set y distance between rows of words</w:t>
             </w:r>
+            <w:r>
+              <w:t xml:space="preserve"> for the robot</w:t>
+            </w:r>
           </w:p>
         </w:tc>
       </w:tr>
@@ -908,6 +1129,7 @@
           <w:p>
             <w:proofErr w:type="spellStart"/>
             <w:r>
+              <w:lastRenderedPageBreak/>
               <w:t>WordLength</w:t>
             </w:r>
             <w:proofErr w:type="spellEnd"/>
@@ -1470,6 +1692,7 @@
     </w:p>
     <w:p>
       <w:r>
+        <w:lastRenderedPageBreak/>
         <w:t xml:space="preserve">Int </w:t>
       </w:r>
       <w:proofErr w:type="spellStart"/>
@@ -1652,7 +1875,6 @@
       </w:pPr>
       <w:proofErr w:type="spellStart"/>
       <w:r>
-        <w:lastRenderedPageBreak/>
         <w:t>Current</w:t>
       </w:r>
       <w:r>
@@ -1823,7 +2045,10 @@
           </w:p>
           <w:p>
             <w:r>
-              <w:t>2. User input font size above 10 and below 4</w:t>
+              <w:t xml:space="preserve">2. User input font size </w:t>
+            </w:r>
+            <w:r>
+              <w:t>of 11 and test again with font size of 2</w:t>
             </w:r>
           </w:p>
           <w:p>
@@ -1833,7 +2058,19 @@
           </w:p>
           <w:p>
             <w:r>
-              <w:t>4. Detele text file</w:t>
+              <w:t>4. De</w:t>
+            </w:r>
+            <w:r>
+              <w:t>l</w:t>
+            </w:r>
+            <w:r>
+              <w:t>e</w:t>
+            </w:r>
+            <w:r>
+              <w:t>t</w:t>
+            </w:r>
+            <w:r>
+              <w:t>e text file</w:t>
             </w:r>
           </w:p>
           <w:p>
@@ -2063,14 +2300,36 @@
           </w:tcPr>
           <w:p>
             <w:r>
-              <w:t>test</w:t>
-            </w:r>
-            <w:r>
-              <w:t>.txt</w:t>
+              <w:t>Test.t</w:t>
+            </w:r>
+            <w:r>
+              <w:t>xt</w:t>
+            </w:r>
+            <w:r>
+              <w:t xml:space="preserve"> containing:</w:t>
+            </w:r>
+          </w:p>
+          <w:p>
+            <w:r>
+              <w:t xml:space="preserve">“Test </w:t>
+            </w:r>
+            <w:r>
+              <w:t>of</w:t>
             </w:r>
             <w:r>
               <w:t xml:space="preserve"> </w:t>
             </w:r>
+            <w:r>
+              <w:t xml:space="preserve">Word </w:t>
+            </w:r>
+          </w:p>
+          <w:p>
+            <w:r>
+              <w:t>Saving”</w:t>
+            </w:r>
+            <w:r>
+              <w:t xml:space="preserve"> </w:t>
+            </w:r>
           </w:p>
         </w:tc>
         <w:tc>
@@ -2088,6 +2347,46 @@
             <w:proofErr w:type="spellEnd"/>
             <w:r>
               <w:t>() array contains all the characters in test.txt with letters in the same word separated along columns and different words separated along rows</w:t>
+            </w:r>
+            <w:r>
+              <w:t xml:space="preserve">. Should look like this </w:t>
+            </w:r>
+            <w:r>
+              <w:drawing>
+                <wp:inline distT="0" distB="0" distL="0" distR="0" wp14:anchorId="25D9F25F" wp14:editId="3533E47A">
+                  <wp:extent cx="1466977" cy="381033"/>
+                  <wp:effectExtent l="0" t="0" r="0" b="0"/>
+                  <wp:docPr id="496817817" name="Picture 1"/>
+                  <wp:cNvGraphicFramePr>
+                    <a:graphicFrameLocks xmlns:a="http://schemas.openxmlformats.org/drawingml/2006/main" noChangeAspect="1"/>
+                  </wp:cNvGraphicFramePr>
+                  <a:graphic xmlns:a="http://schemas.openxmlformats.org/drawingml/2006/main">
+                    <a:graphicData uri="http://schemas.openxmlformats.org/drawingml/2006/picture">
+                      <pic:pic xmlns:pic="http://schemas.openxmlformats.org/drawingml/2006/picture">
+                        <pic:nvPicPr>
+                          <pic:cNvPr id="496817817" name=""/>
+                          <pic:cNvPicPr/>
+                        </pic:nvPicPr>
+                        <pic:blipFill>
+                          <a:blip r:embed="rId5"/>
+                          <a:stretch>
+                            <a:fillRect/>
+                          </a:stretch>
+                        </pic:blipFill>
+                        <pic:spPr>
+                          <a:xfrm>
+                            <a:off x="0" y="0"/>
+                            <a:ext cx="1466977" cy="381033"/>
+                          </a:xfrm>
+                          <a:prstGeom prst="rect">
+                            <a:avLst/>
+                          </a:prstGeom>
+                        </pic:spPr>
+                      </pic:pic>
+                    </a:graphicData>
+                  </a:graphic>
+                </wp:inline>
+              </w:drawing>
             </w:r>
           </w:p>
         </w:tc>
@@ -2139,6 +2438,92 @@
             <w:r>
               <w:t>()</w:t>
             </w:r>
+            <w:r>
+              <w:t xml:space="preserve">. For 1. </w:t>
+            </w:r>
+          </w:p>
+          <w:p>
+            <w:r>
+              <w:drawing>
+                <wp:inline distT="0" distB="0" distL="0" distR="0" wp14:anchorId="1D3B5913" wp14:editId="08D4E3A1">
+                  <wp:extent cx="990686" cy="342930"/>
+                  <wp:effectExtent l="0" t="0" r="0" b="0"/>
+                  <wp:docPr id="296896071" name="Picture 1"/>
+                  <wp:cNvGraphicFramePr>
+                    <a:graphicFrameLocks xmlns:a="http://schemas.openxmlformats.org/drawingml/2006/main" noChangeAspect="1"/>
+                  </wp:cNvGraphicFramePr>
+                  <a:graphic xmlns:a="http://schemas.openxmlformats.org/drawingml/2006/main">
+                    <a:graphicData uri="http://schemas.openxmlformats.org/drawingml/2006/picture">
+                      <pic:pic xmlns:pic="http://schemas.openxmlformats.org/drawingml/2006/picture">
+                        <pic:nvPicPr>
+                          <pic:cNvPr id="296896071" name=""/>
+                          <pic:cNvPicPr/>
+                        </pic:nvPicPr>
+                        <pic:blipFill>
+                          <a:blip r:embed="rId6"/>
+                          <a:stretch>
+                            <a:fillRect/>
+                          </a:stretch>
+                        </pic:blipFill>
+                        <pic:spPr>
+                          <a:xfrm>
+                            <a:off x="0" y="0"/>
+                            <a:ext cx="990686" cy="342930"/>
+                          </a:xfrm>
+                          <a:prstGeom prst="rect">
+                            <a:avLst/>
+                          </a:prstGeom>
+                        </pic:spPr>
+                      </pic:pic>
+                    </a:graphicData>
+                  </a:graphic>
+                </wp:inline>
+              </w:drawing>
+            </w:r>
+          </w:p>
+          <w:p>
+            <w:r>
+              <w:t>For 2:</w:t>
+            </w:r>
+          </w:p>
+          <w:p>
+            <w:r>
+              <w:drawing>
+                <wp:inline distT="0" distB="0" distL="0" distR="0" wp14:anchorId="65467622" wp14:editId="5B2ED80F">
+                  <wp:extent cx="1318260" cy="88265"/>
+                  <wp:effectExtent l="0" t="0" r="0" b="6985"/>
+                  <wp:docPr id="1804823697" name="Picture 1"/>
+                  <wp:cNvGraphicFramePr>
+                    <a:graphicFrameLocks xmlns:a="http://schemas.openxmlformats.org/drawingml/2006/main" noChangeAspect="1"/>
+                  </wp:cNvGraphicFramePr>
+                  <a:graphic xmlns:a="http://schemas.openxmlformats.org/drawingml/2006/main">
+                    <a:graphicData uri="http://schemas.openxmlformats.org/drawingml/2006/picture">
+                      <pic:pic xmlns:pic="http://schemas.openxmlformats.org/drawingml/2006/picture">
+                        <pic:nvPicPr>
+                          <pic:cNvPr id="1804823697" name=""/>
+                          <pic:cNvPicPr/>
+                        </pic:nvPicPr>
+                        <pic:blipFill>
+                          <a:blip r:embed="rId7"/>
+                          <a:stretch>
+                            <a:fillRect/>
+                          </a:stretch>
+                        </pic:blipFill>
+                        <pic:spPr>
+                          <a:xfrm>
+                            <a:off x="0" y="0"/>
+                            <a:ext cx="1318260" cy="88265"/>
+                          </a:xfrm>
+                          <a:prstGeom prst="rect">
+                            <a:avLst/>
+                          </a:prstGeom>
+                        </pic:spPr>
+                      </pic:pic>
+                    </a:graphicData>
+                  </a:graphic>
+                </wp:inline>
+              </w:drawing>
+            </w:r>
           </w:p>
         </w:tc>
         <w:tc>
@@ -2152,9 +2537,13 @@
             <w:r>
               <w:t>Each letter of each word should be sent to robot in G code and only send data when the robot asks for it</w:t>
             </w:r>
-          </w:p>
-          <w:p>
-            <w:r>
+            <w:r>
+              <w:t xml:space="preserve">. Words do not run off page </w:t>
+            </w:r>
+          </w:p>
+          <w:p>
+            <w:r>
+              <w:lastRenderedPageBreak/>
               <w:t xml:space="preserve">2. Error when processing data and program stops </w:t>
             </w:r>
             <w:r>
@@ -2180,6 +2569,7 @@
           <w:p>
             <w:proofErr w:type="spellStart"/>
             <w:r>
+              <w:lastRenderedPageBreak/>
               <w:t>SendToRobot</w:t>
             </w:r>
             <w:proofErr w:type="spellEnd"/>
@@ -2379,7 +2769,6 @@
         <w:rPr>
           <w:lang w:val="it-IT"/>
         </w:rPr>
-        <w:lastRenderedPageBreak/>
         <w:t>AI Statement</w:t>
       </w:r>
     </w:p>
@@ -2556,6 +2945,178 @@
       </w:pPr>
     </w:lvl>
   </w:abstractNum>
+  <w:abstractNum w:abstractNumId="1" w15:restartNumberingAfterBreak="0">
+    <w:nsid w:val="39C45B88"/>
+    <w:multiLevelType w:val="hybridMultilevel"/>
+    <w:tmpl w:val="8AB261C8"/>
+    <w:lvl w:ilvl="0" w:tplc="0809000F">
+      <w:start w:val="1"/>
+      <w:numFmt w:val="decimal"/>
+      <w:lvlText w:val="%1."/>
+      <w:lvlJc w:val="left"/>
+      <w:pPr>
+        <w:ind w:left="720" w:hanging="360"/>
+      </w:pPr>
+    </w:lvl>
+    <w:lvl w:ilvl="1" w:tplc="08090019">
+      <w:start w:val="1"/>
+      <w:numFmt w:val="lowerLetter"/>
+      <w:lvlText w:val="%2."/>
+      <w:lvlJc w:val="left"/>
+      <w:pPr>
+        <w:ind w:left="1440" w:hanging="360"/>
+      </w:pPr>
+    </w:lvl>
+    <w:lvl w:ilvl="2" w:tplc="0809001B" w:tentative="1">
+      <w:start w:val="1"/>
+      <w:numFmt w:val="lowerRoman"/>
+      <w:lvlText w:val="%3."/>
+      <w:lvlJc w:val="right"/>
+      <w:pPr>
+        <w:ind w:left="2160" w:hanging="180"/>
+      </w:pPr>
+    </w:lvl>
+    <w:lvl w:ilvl="3" w:tplc="0809000F" w:tentative="1">
+      <w:start w:val="1"/>
+      <w:numFmt w:val="decimal"/>
+      <w:lvlText w:val="%4."/>
+      <w:lvlJc w:val="left"/>
+      <w:pPr>
+        <w:ind w:left="2880" w:hanging="360"/>
+      </w:pPr>
+    </w:lvl>
+    <w:lvl w:ilvl="4" w:tplc="08090019" w:tentative="1">
+      <w:start w:val="1"/>
+      <w:numFmt w:val="lowerLetter"/>
+      <w:lvlText w:val="%5."/>
+      <w:lvlJc w:val="left"/>
+      <w:pPr>
+        <w:ind w:left="3600" w:hanging="360"/>
+      </w:pPr>
+    </w:lvl>
+    <w:lvl w:ilvl="5" w:tplc="0809001B" w:tentative="1">
+      <w:start w:val="1"/>
+      <w:numFmt w:val="lowerRoman"/>
+      <w:lvlText w:val="%6."/>
+      <w:lvlJc w:val="right"/>
+      <w:pPr>
+        <w:ind w:left="4320" w:hanging="180"/>
+      </w:pPr>
+    </w:lvl>
+    <w:lvl w:ilvl="6" w:tplc="0809000F" w:tentative="1">
+      <w:start w:val="1"/>
+      <w:numFmt w:val="decimal"/>
+      <w:lvlText w:val="%7."/>
+      <w:lvlJc w:val="left"/>
+      <w:pPr>
+        <w:ind w:left="5040" w:hanging="360"/>
+      </w:pPr>
+    </w:lvl>
+    <w:lvl w:ilvl="7" w:tplc="08090019" w:tentative="1">
+      <w:start w:val="1"/>
+      <w:numFmt w:val="lowerLetter"/>
+      <w:lvlText w:val="%8."/>
+      <w:lvlJc w:val="left"/>
+      <w:pPr>
+        <w:ind w:left="5760" w:hanging="360"/>
+      </w:pPr>
+    </w:lvl>
+    <w:lvl w:ilvl="8" w:tplc="0809001B" w:tentative="1">
+      <w:start w:val="1"/>
+      <w:numFmt w:val="lowerRoman"/>
+      <w:lvlText w:val="%9."/>
+      <w:lvlJc w:val="right"/>
+      <w:pPr>
+        <w:ind w:left="6480" w:hanging="180"/>
+      </w:pPr>
+    </w:lvl>
+  </w:abstractNum>
+  <w:abstractNum w:abstractNumId="2" w15:restartNumberingAfterBreak="0">
+    <w:nsid w:val="769D47D1"/>
+    <w:multiLevelType w:val="hybridMultilevel"/>
+    <w:tmpl w:val="BA108D58"/>
+    <w:lvl w:ilvl="0" w:tplc="0809000F">
+      <w:start w:val="1"/>
+      <w:numFmt w:val="decimal"/>
+      <w:lvlText w:val="%1."/>
+      <w:lvlJc w:val="left"/>
+      <w:pPr>
+        <w:ind w:left="720" w:hanging="360"/>
+      </w:pPr>
+    </w:lvl>
+    <w:lvl w:ilvl="1" w:tplc="08090019" w:tentative="1">
+      <w:start w:val="1"/>
+      <w:numFmt w:val="lowerLetter"/>
+      <w:lvlText w:val="%2."/>
+      <w:lvlJc w:val="left"/>
+      <w:pPr>
+        <w:ind w:left="1440" w:hanging="360"/>
+      </w:pPr>
+    </w:lvl>
+    <w:lvl w:ilvl="2" w:tplc="0809001B" w:tentative="1">
+      <w:start w:val="1"/>
+      <w:numFmt w:val="lowerRoman"/>
+      <w:lvlText w:val="%3."/>
+      <w:lvlJc w:val="right"/>
+      <w:pPr>
+        <w:ind w:left="2160" w:hanging="180"/>
+      </w:pPr>
+    </w:lvl>
+    <w:lvl w:ilvl="3" w:tplc="0809000F" w:tentative="1">
+      <w:start w:val="1"/>
+      <w:numFmt w:val="decimal"/>
+      <w:lvlText w:val="%4."/>
+      <w:lvlJc w:val="left"/>
+      <w:pPr>
+        <w:ind w:left="2880" w:hanging="360"/>
+      </w:pPr>
+    </w:lvl>
+    <w:lvl w:ilvl="4" w:tplc="08090019" w:tentative="1">
+      <w:start w:val="1"/>
+      <w:numFmt w:val="lowerLetter"/>
+      <w:lvlText w:val="%5."/>
+      <w:lvlJc w:val="left"/>
+      <w:pPr>
+        <w:ind w:left="3600" w:hanging="360"/>
+      </w:pPr>
+    </w:lvl>
+    <w:lvl w:ilvl="5" w:tplc="0809001B" w:tentative="1">
+      <w:start w:val="1"/>
+      <w:numFmt w:val="lowerRoman"/>
+      <w:lvlText w:val="%6."/>
+      <w:lvlJc w:val="right"/>
+      <w:pPr>
+        <w:ind w:left="4320" w:hanging="180"/>
+      </w:pPr>
+    </w:lvl>
+    <w:lvl w:ilvl="6" w:tplc="0809000F" w:tentative="1">
+      <w:start w:val="1"/>
+      <w:numFmt w:val="decimal"/>
+      <w:lvlText w:val="%7."/>
+      <w:lvlJc w:val="left"/>
+      <w:pPr>
+        <w:ind w:left="5040" w:hanging="360"/>
+      </w:pPr>
+    </w:lvl>
+    <w:lvl w:ilvl="7" w:tplc="08090019" w:tentative="1">
+      <w:start w:val="1"/>
+      <w:numFmt w:val="lowerLetter"/>
+      <w:lvlText w:val="%8."/>
+      <w:lvlJc w:val="left"/>
+      <w:pPr>
+        <w:ind w:left="5760" w:hanging="360"/>
+      </w:pPr>
+    </w:lvl>
+    <w:lvl w:ilvl="8" w:tplc="0809001B" w:tentative="1">
+      <w:start w:val="1"/>
+      <w:numFmt w:val="lowerRoman"/>
+      <w:lvlText w:val="%9."/>
+      <w:lvlJc w:val="right"/>
+      <w:pPr>
+        <w:ind w:left="6480" w:hanging="180"/>
+      </w:pPr>
+    </w:lvl>
+  </w:abstractNum>
   <w:num w:numId="1" w16cid:durableId="52965837">
     <w:abstractNumId w:val="0"/>
     <w:lvlOverride w:ilvl="0">
@@ -2568,6 +3129,12 @@
     <w:lvlOverride w:ilvl="1">
       <w:startOverride w:val="1"/>
     </w:lvlOverride>
+  </w:num>
+  <w:num w:numId="3" w16cid:durableId="115100851">
+    <w:abstractNumId w:val="1"/>
+  </w:num>
+  <w:num w:numId="4" w16cid:durableId="814639347">
+    <w:abstractNumId w:val="2"/>
   </w:num>
 </w:numbering>
 </file>
@@ -2968,7 +3535,7 @@
   <w:style w:type="paragraph" w:default="1" w:styleId="Normal">
     <w:name w:val="Normal"/>
     <w:qFormat/>
-    <w:rsid w:val="006A1DE8"/>
+    <w:rsid w:val="00185C17"/>
     <w:rPr>
       <w:sz w:val="22"/>
     </w:rPr>

</xml_diff>